<commit_message>
Actualizar reporte con seccion de diseno (prototipo en Figma)
Version final del equipo: agrega la seccion "Diseno - Prototipo en
Figma" con el diagrama de flujo de usuario, ademas del contenido ya
existente (CRUD, animaciones, gestos, zoom con pellizco, diseno
responsivo). El PDF se regenero desde este docx para mantenerlos
sincronizados.

Co-Authored-By: Claude Sonnet 5 <noreply@anthropic.com>
</commit_message>
<xml_diff>
--- a/Documentación/Actividad 4 Tec (App Movil).docx
+++ b/Documentación/Actividad 4 Tec (App Movil).docx
@@ -1,6 +1,6 @@
 
 <file path=word/document.xml><?xml version="1.0" encoding="utf-8"?>
-<w:document xmlns:wpc="http://schemas.microsoft.com/office/word/2010/wordprocessingCanvas" xmlns:cx="http://schemas.microsoft.com/office/drawing/2014/chartex" xmlns:cx1="http://schemas.microsoft.com/office/drawing/2015/9/8/chartex" xmlns:cx2="http://schemas.microsoft.com/office/drawing/2015/10/21/chartex" xmlns:cx3="http://schemas.microsoft.com/office/drawing/2016/5/9/chartex" xmlns:cx4="http://schemas.microsoft.com/office/drawing/2016/5/10/chartex" xmlns:cx5="http://schemas.microsoft.com/office/drawing/2016/5/11/chartex" xmlns:cx6="http://schemas.microsoft.com/office/drawing/2016/5/12/chartex" xmlns:cx7="http://schemas.microsoft.com/office/drawing/2016/5/13/chartex" xmlns:cx8="http://schemas.microsoft.com/office/drawing/2016/5/14/chartex" xmlns:mc="http://schemas.openxmlformats.org/markup-compatibility/2006" xmlns:aink="http://schemas.microsoft.com/office/drawing/2016/ink" xmlns:am3d="http://schemas.microsoft.com/office/drawing/2017/model3d" xmlns:o="urn:schemas-microsoft-com:office:office" xmlns:oel="http://schemas.microsoft.com/office/2019/extlst" xmlns:r="http://schemas.openxmlformats.org/officeDocument/2006/relationships" xmlns:m="http://schemas.openxmlformats.org/officeDocument/2006/math" xmlns:v="urn:schemas-microsoft-com:vml" xmlns:wp14="http://schemas.microsoft.com/office/word/2010/wordprocessingDrawing" xmlns:wp="http://schemas.openxmlformats.org/drawingml/2006/wordprocessingDrawing" xmlns:w10="urn:schemas-microsoft-com:office:word" xmlns:w="http://schemas.openxmlformats.org/wordprocessingml/2006/main" xmlns:w14="http://schemas.microsoft.com/office/word/2010/wordml" xmlns:w15="http://schemas.microsoft.com/office/word/2012/wordml" xmlns:w16cex="http://schemas.microsoft.com/office/word/2018/wordml/cex" xmlns:w16cid="http://schemas.microsoft.com/office/word/2016/wordml/cid" xmlns:w16="http://schemas.microsoft.com/office/word/2018/wordml" xmlns:w16sdtdh="http://schemas.microsoft.com/office/word/2020/wordml/sdtdatahash" xmlns:w16se="http://schemas.microsoft.com/office/word/2015/wordml/symex" xmlns:wpg="http://schemas.microsoft.com/office/word/2010/wordprocessingGroup" xmlns:wpi="http://schemas.microsoft.com/office/word/2010/wordprocessingInk" xmlns:wne="http://schemas.microsoft.com/office/word/2006/wordml" xmlns:wps="http://schemas.microsoft.com/office/word/2010/wordprocessingShape" mc:Ignorable="w14 w15 w16se w16cid w16 w16cex w16sdtdh wp14">
+<w:document xmlns:wpc="http://schemas.microsoft.com/office/word/2010/wordprocessingCanvas" xmlns:cx="http://schemas.microsoft.com/office/drawing/2014/chartex" xmlns:cx1="http://schemas.microsoft.com/office/drawing/2015/9/8/chartex" xmlns:cx2="http://schemas.microsoft.com/office/drawing/2015/10/21/chartex" xmlns:cx3="http://schemas.microsoft.com/office/drawing/2016/5/9/chartex" xmlns:cx4="http://schemas.microsoft.com/office/drawing/2016/5/10/chartex" xmlns:cx5="http://schemas.microsoft.com/office/drawing/2016/5/11/chartex" xmlns:cx6="http://schemas.microsoft.com/office/drawing/2016/5/12/chartex" xmlns:cx7="http://schemas.microsoft.com/office/drawing/2016/5/13/chartex" xmlns:cx8="http://schemas.microsoft.com/office/drawing/2016/5/14/chartex" xmlns:mc="http://schemas.openxmlformats.org/markup-compatibility/2006" xmlns:aink="http://schemas.microsoft.com/office/drawing/2016/ink" xmlns:am3d="http://schemas.microsoft.com/office/drawing/2017/model3d" xmlns:o="urn:schemas-microsoft-com:office:office" xmlns:oel="http://schemas.microsoft.com/office/2019/extlst" xmlns:r="http://schemas.openxmlformats.org/officeDocument/2006/relationships" xmlns:m="http://schemas.openxmlformats.org/officeDocument/2006/math" xmlns:v="urn:schemas-microsoft-com:vml" xmlns:wp14="http://schemas.microsoft.com/office/word/2010/wordprocessingDrawing" xmlns:wp="http://schemas.openxmlformats.org/drawingml/2006/wordprocessingDrawing" xmlns:w10="urn:schemas-microsoft-com:office:word" xmlns:w="http://schemas.openxmlformats.org/wordprocessingml/2006/main" xmlns:w14="http://schemas.microsoft.com/office/word/2010/wordml" xmlns:w15="http://schemas.microsoft.com/office/word/2012/wordml" xmlns:w16cex="http://schemas.microsoft.com/office/word/2018/wordml/cex" xmlns:w16cid="http://schemas.microsoft.com/office/word/2016/wordml/cid" xmlns:w16="http://schemas.microsoft.com/office/word/2018/wordml" xmlns:w16du="http://schemas.microsoft.com/office/word/2023/wordml/word16du" xmlns:w16sdtdh="http://schemas.microsoft.com/office/word/2020/wordml/sdtdatahash" xmlns:w16sdtfl="http://schemas.microsoft.com/office/word/2024/wordml/sdtformatlock" xmlns:w16se="http://schemas.microsoft.com/office/word/2015/wordml/symex" xmlns:wpg="http://schemas.microsoft.com/office/word/2010/wordprocessingGroup" xmlns:wpi="http://schemas.microsoft.com/office/word/2010/wordprocessingInk" xmlns:wne="http://schemas.microsoft.com/office/word/2006/wordml" xmlns:wps="http://schemas.microsoft.com/office/word/2010/wordprocessingShape" mc:Ignorable="w14 w15 w16se w16cid w16 w16cex w16sdtdh w16sdtfl w16du wp14">
   <w:body>
     <w:p>
       <w:pPr>
@@ -112,6 +112,11 @@
             </w:pict>
           </mc:Fallback>
         </mc:AlternateContent>
+      </w:r>
+      <w:r>
+        <w:rPr>
+          <w:noProof/>
+        </w:rPr>
         <w:drawing>
           <wp:anchor distT="0" distB="0" distL="114300" distR="114300" simplePos="0" relativeHeight="251660288" behindDoc="0" locked="0" layoutInCell="1" allowOverlap="1" wp14:anchorId="70839B0A" wp14:editId="03DFC579">
             <wp:simplePos x="0" y="0"/>
@@ -186,7 +191,7 @@
           <w:sz w:val="72"/>
           <w:szCs w:val="72"/>
         </w:rPr>
-        <w:t xml:space="preserve">Actividad 4</w:t>
+        <w:t>Actividad 4</w:t>
       </w:r>
     </w:p>
     <w:p>
@@ -402,7 +407,7 @@
           <w:sz w:val="36"/>
           <w:szCs w:val="36"/>
         </w:rPr>
-        <w:t xml:space="preserve">Luis Fernando Núñez Díaz - Ricardo Baranda Cisneros – Bryan David Mariñelarena Ponce</w:t>
+        <w:t>Luis Fernando Núñez Díaz - Ricardo Baranda Cisneros – Bryan David Mariñelarena Ponce</w:t>
       </w:r>
     </w:p>
     <w:p>
@@ -534,7 +539,7 @@
     </w:p>
     <w:p>
       <w:r>
-        <w:t xml:space="preserve">Genera una aplicación de gestión de tareas que utilice Room para persistencia de datos locales, integrando operaciones CRUD, validaciones de entrada y una interfaz reactiva con Jetpack Compose. </w:t>
+        <w:t>Genera una aplicación de gestión de tareas que utilice Room para persistencia de datos locales, integrando operaciones CRUD, validaciones de entrada y una interfaz reactiva con Jetpack Compose. </w:t>
       </w:r>
     </w:p>
     <w:p/>
@@ -601,7 +606,7 @@
         </w:numPr>
       </w:pPr>
       <w:r>
-        <w:t xml:space="preserve">Agrega las dependencias de Room al archivo build.gradle (usar versión 2.7.1 o superior). </w:t>
+        <w:t>Agrega las dependencias de Room al archivo build.gradle (usar versión 2.7.1 o superior). </w:t>
       </w:r>
     </w:p>
     <w:p>
@@ -848,7 +853,7 @@
         </w:numPr>
       </w:pPr>
       <w:r>
-        <w:t xml:space="preserve">Implementa una clase AppDatabase abstracta con patrón Singleton. </w:t>
+        <w:t>Implementa una clase AppDatabase abstracta con patrón Singleton. </w:t>
       </w:r>
     </w:p>
     <w:p>
@@ -1315,6 +1320,11 @@
             </wp14:sizeRelV>
           </wp:anchor>
         </w:drawing>
+      </w:r>
+      <w:r>
+        <w:rPr>
+          <w:noProof/>
+        </w:rPr>
         <w:drawing>
           <wp:anchor distT="0" distB="0" distL="114300" distR="114300" simplePos="0" relativeHeight="251667456" behindDoc="0" locked="0" layoutInCell="1" allowOverlap="1" wp14:anchorId="4496A7FC" wp14:editId="13B75D5D">
             <wp:simplePos x="0" y="0"/>
@@ -1645,6 +1655,11 @@
             </wp14:sizeRelV>
           </wp:anchor>
         </w:drawing>
+      </w:r>
+      <w:r>
+        <w:rPr>
+          <w:noProof/>
+        </w:rPr>
         <w:drawing>
           <wp:anchor distT="0" distB="0" distL="114300" distR="114300" simplePos="0" relativeHeight="251669504" behindDoc="0" locked="0" layoutInCell="1" allowOverlap="1" wp14:anchorId="652D4428" wp14:editId="2B61CE14">
             <wp:simplePos x="0" y="0"/>
@@ -1859,7 +1874,7 @@
     </w:p>
     <w:p>
       <w:r>
-        <w:t xml:space="preserve">Desarrollar una aplicación móvil que combine animaciones fluidas, gestos intuitivos y almacenamiento local con Room, priorizando una experiencia de usuario cohesiva y eficiente. </w:t>
+        <w:t>Desarrollar una aplicación móvil que combine animaciones fluidas, gestos intuitivos y almacenamiento local con Room, priorizando una experiencia de usuario cohesiva y eficiente. </w:t>
       </w:r>
     </w:p>
     <w:p/>
@@ -1909,6 +1924,122 @@
     <w:p>
       <w:pPr>
         <w:rPr>
+          <w:b/>
+          <w:bCs/>
+          <w:color w:val="ED7D31" w:themeColor="accent2"/>
+          <w:sz w:val="32"/>
+          <w:szCs w:val="28"/>
+        </w:rPr>
+      </w:pPr>
+      <w:r>
+        <w:rPr>
+          <w:b/>
+          <w:bCs/>
+          <w:color w:val="ED7D31" w:themeColor="accent2"/>
+          <w:sz w:val="32"/>
+          <w:szCs w:val="28"/>
+        </w:rPr>
+        <w:t xml:space="preserve">Diseño – Prototipo en </w:t>
+      </w:r>
+      <w:proofErr w:type="spellStart"/>
+      <w:r>
+        <w:rPr>
+          <w:b/>
+          <w:bCs/>
+          <w:color w:val="ED7D31" w:themeColor="accent2"/>
+          <w:sz w:val="32"/>
+          <w:szCs w:val="28"/>
+        </w:rPr>
+        <w:t>Figma</w:t>
+      </w:r>
+      <w:proofErr w:type="spellEnd"/>
+    </w:p>
+    <w:p>
+      <w:pPr>
+        <w:rPr>
+          <w:b/>
+          <w:bCs/>
+          <w:color w:val="ED7D31" w:themeColor="accent2"/>
+          <w:sz w:val="32"/>
+          <w:szCs w:val="28"/>
+        </w:rPr>
+      </w:pPr>
+      <w:r>
+        <w:rPr>
+          <w:b/>
+          <w:bCs/>
+          <w:color w:val="ED7D31" w:themeColor="accent2"/>
+          <w:sz w:val="32"/>
+          <w:szCs w:val="28"/>
+        </w:rPr>
+        <w:t xml:space="preserve">Flujo de usuario: </w:t>
+      </w:r>
+    </w:p>
+    <w:p>
+      <w:r>
+        <w:rPr>
+          <w:noProof/>
+        </w:rPr>
+        <w:drawing>
+          <wp:inline distT="0" distB="0" distL="0" distR="0" wp14:anchorId="5322B19C" wp14:editId="75048CC1">
+            <wp:extent cx="3415553" cy="3505200"/>
+            <wp:effectExtent l="0" t="0" r="0" b="0"/>
+            <wp:docPr id="1073783263" name="Imagen 1"/>
+            <wp:cNvGraphicFramePr>
+              <a:graphicFrameLocks xmlns:a="http://schemas.openxmlformats.org/drawingml/2006/main" noChangeAspect="1"/>
+            </wp:cNvGraphicFramePr>
+            <a:graphic xmlns:a="http://schemas.openxmlformats.org/drawingml/2006/main">
+              <a:graphicData uri="http://schemas.openxmlformats.org/drawingml/2006/picture">
+                <pic:pic xmlns:pic="http://schemas.openxmlformats.org/drawingml/2006/picture">
+                  <pic:nvPicPr>
+                    <pic:cNvPr id="1073783263" name=""/>
+                    <pic:cNvPicPr/>
+                  </pic:nvPicPr>
+                  <pic:blipFill>
+                    <a:blip r:embed="rId16"/>
+                    <a:stretch>
+                      <a:fillRect/>
+                    </a:stretch>
+                  </pic:blipFill>
+                  <pic:spPr>
+                    <a:xfrm>
+                      <a:off x="0" y="0"/>
+                      <a:ext cx="3420622" cy="3510402"/>
+                    </a:xfrm>
+                    <a:prstGeom prst="rect">
+                      <a:avLst/>
+                    </a:prstGeom>
+                  </pic:spPr>
+                </pic:pic>
+              </a:graphicData>
+            </a:graphic>
+          </wp:inline>
+        </w:drawing>
+      </w:r>
+    </w:p>
+    <w:p>
+      <w:r>
+        <w:t>El diseño de la aplicación se centra en una pantalla principal desde la cual el usuario puede visualizar, buscar y administrar sus notas. Mediante el botón “Nueva nota” es posible acceder a un diálogo para ingresar título, contenido y color. Las notas existentes permiten distintas formas de interacción: un toque abre la edición, un deslizamiento horizontal elimina la nota y una pulsación prolongada abre el modo de lectura ampliada. El buscador actualiza los resultados conforme el usuario introduce texto. Después de cada operación CRUD, la interfaz refleja automáticamente los cambios almacenados mediante Room.</w:t>
+      </w:r>
+    </w:p>
+    <w:p>
+      <w:r>
+        <w:lastRenderedPageBreak/>
+        <w:t xml:space="preserve">A continuación, el orden de las pantallas por orden de experiencia de usuario: Pantalla de inicio con notas y sin notas: </w:t>
+      </w:r>
+    </w:p>
+    <w:p>
+      <w:pPr>
+        <w:rPr>
+          <w:b/>
+          <w:bCs/>
+          <w:lang w:eastAsia="es-MX"/>
+        </w:rPr>
+      </w:pPr>
+    </w:p>
+    <w:p>
+      <w:pPr>
+        <w:rPr>
           <w:lang w:eastAsia="es-MX"/>
         </w:rPr>
       </w:pPr>
@@ -1924,7 +2055,7 @@
           <w:bCs/>
           <w:lang w:eastAsia="es-MX"/>
         </w:rPr>
-        <w:t xml:space="preserve">Android Studio utilizando Kotlin</w:t>
+        <w:t>Android Studio utilizando Kotlin</w:t>
       </w:r>
       <w:r>
         <w:rPr>
@@ -1938,7 +2069,7 @@
           <w:bCs/>
           <w:lang w:eastAsia="es-MX"/>
         </w:rPr>
-        <w:t xml:space="preserve">Jetpack Compose</w:t>
+        <w:t>Jetpack Compose</w:t>
       </w:r>
       <w:r>
         <w:rPr>
@@ -2086,24 +2217,16 @@
       </w:pPr>
       <w:r>
         <w:rPr>
-          <w:lang w:eastAsia="es-MX"/>
-        </w:rPr>
-        <w:t xml:space="preserve">También se implementaron los componentes de Room necesarios, como NoteDao, NoteDatabase, los conversores de datos y el repositorio.</w:t>
-      </w:r>
-    </w:p>
-    <w:p>
-      <w:r>
-        <w:rPr>
           <w:noProof/>
         </w:rPr>
         <w:drawing>
-          <wp:anchor distT="0" distB="0" distL="114300" distR="114300" simplePos="0" relativeHeight="251671552" behindDoc="0" locked="0" layoutInCell="1" allowOverlap="1" wp14:anchorId="7792E41E" wp14:editId="4A61A757">
+          <wp:anchor distT="0" distB="0" distL="114300" distR="114300" simplePos="0" relativeHeight="251671552" behindDoc="0" locked="0" layoutInCell="1" allowOverlap="1" wp14:anchorId="7792E41E" wp14:editId="197F8078">
             <wp:simplePos x="0" y="0"/>
             <wp:positionH relativeFrom="margin">
-              <wp:posOffset>19050</wp:posOffset>
+              <wp:posOffset>765810</wp:posOffset>
             </wp:positionH>
             <wp:positionV relativeFrom="paragraph">
-              <wp:posOffset>131445</wp:posOffset>
+              <wp:posOffset>393700</wp:posOffset>
             </wp:positionV>
             <wp:extent cx="1620000" cy="3510001"/>
             <wp:effectExtent l="152400" t="152400" r="361315" b="357505"/>
@@ -2122,7 +2245,7 @@
                     </pic:cNvPicPr>
                   </pic:nvPicPr>
                   <pic:blipFill>
-                    <a:blip r:embed="rId16" cstate="print">
+                    <a:blip r:embed="rId17" cstate="print">
                       <a:extLst>
                         <a:ext uri="{28A0092B-C50C-407E-A947-70E740481C1C}">
                           <a14:useLocalDpi xmlns:a14="http://schemas.microsoft.com/office/drawing/2010/main" val="0"/>
@@ -2165,7 +2288,14 @@
           </wp:anchor>
         </w:drawing>
       </w:r>
-    </w:p>
+      <w:r>
+        <w:rPr>
+          <w:lang w:eastAsia="es-MX"/>
+        </w:rPr>
+        <w:t>También se implementaron los componentes de Room necesarios, como NoteDao, NoteDatabase, los conversores de datos y el repositorio.</w:t>
+      </w:r>
+    </w:p>
+    <w:p/>
     <w:p/>
     <w:p/>
     <w:p/>
@@ -2196,7 +2326,6 @@
           <w:bCs/>
           <w:lang w:eastAsia="es-MX"/>
         </w:rPr>
-        <w:lastRenderedPageBreak/>
         <w:t>Implementar operaciones CRUD:</w:t>
       </w:r>
     </w:p>
@@ -2322,6 +2451,7 @@
           <w:bCs/>
           <w:lang w:eastAsia="es-MX"/>
         </w:rPr>
+        <w:lastRenderedPageBreak/>
         <w:t>Eliminar:</w:t>
       </w:r>
       <w:r>
@@ -2355,7 +2485,7 @@
         <w:rPr>
           <w:lang w:eastAsia="es-MX"/>
         </w:rPr>
-        <w:t xml:space="preserve">, un Repository y un ViewModel. El NoteDao se encarga de realizar las operaciones directamente sobre la base de datos.</w:t>
+        <w:t>, un Repository y un ViewModel. El NoteDao se encarga de realizar las operaciones directamente sobre la base de datos.</w:t>
       </w:r>
     </w:p>
     <w:p>
@@ -2397,81 +2527,6 @@
                 <pic:pic xmlns:pic="http://schemas.openxmlformats.org/drawingml/2006/picture">
                   <pic:nvPicPr>
                     <pic:cNvPr id="0" name="Picture 4"/>
-                    <pic:cNvPicPr>
-                      <a:picLocks noChangeAspect="1" noChangeArrowheads="1"/>
-                    </pic:cNvPicPr>
-                  </pic:nvPicPr>
-                  <pic:blipFill>
-                    <a:blip r:embed="rId17" cstate="print">
-                      <a:extLst>
-                        <a:ext uri="{28A0092B-C50C-407E-A947-70E740481C1C}">
-                          <a14:useLocalDpi xmlns:a14="http://schemas.microsoft.com/office/drawing/2010/main" val="0"/>
-                        </a:ext>
-                      </a:extLst>
-                    </a:blip>
-                    <a:srcRect/>
-                    <a:stretch>
-                      <a:fillRect/>
-                    </a:stretch>
-                  </pic:blipFill>
-                  <pic:spPr bwMode="auto">
-                    <a:xfrm>
-                      <a:off x="0" y="0"/>
-                      <a:ext cx="1619885" cy="3509645"/>
-                    </a:xfrm>
-                    <a:prstGeom prst="rect">
-                      <a:avLst/>
-                    </a:prstGeom>
-                    <a:ln>
-                      <a:noFill/>
-                    </a:ln>
-                    <a:effectLst>
-                      <a:outerShdw blurRad="292100" dist="139700" dir="2700000" algn="tl" rotWithShape="0">
-                        <a:srgbClr val="333333">
-                          <a:alpha val="65000"/>
-                        </a:srgbClr>
-                      </a:outerShdw>
-                    </a:effectLst>
-                  </pic:spPr>
-                </pic:pic>
-              </a:graphicData>
-            </a:graphic>
-            <wp14:sizeRelH relativeFrom="page">
-              <wp14:pctWidth>0</wp14:pctWidth>
-            </wp14:sizeRelH>
-            <wp14:sizeRelV relativeFrom="page">
-              <wp14:pctHeight>0</wp14:pctHeight>
-            </wp14:sizeRelV>
-          </wp:anchor>
-        </w:drawing>
-      </w:r>
-    </w:p>
-    <w:p>
-      <w:r>
-        <w:rPr>
-          <w:noProof/>
-        </w:rPr>
-        <w:drawing>
-          <wp:anchor distT="0" distB="0" distL="114300" distR="114300" simplePos="0" relativeHeight="251674624" behindDoc="0" locked="0" layoutInCell="1" allowOverlap="1" wp14:anchorId="719CE79B" wp14:editId="2FDADA0F">
-            <wp:simplePos x="0" y="0"/>
-            <wp:positionH relativeFrom="column">
-              <wp:posOffset>3787140</wp:posOffset>
-            </wp:positionH>
-            <wp:positionV relativeFrom="paragraph">
-              <wp:posOffset>10160</wp:posOffset>
-            </wp:positionV>
-            <wp:extent cx="1619885" cy="3509645"/>
-            <wp:effectExtent l="152400" t="152400" r="361315" b="357505"/>
-            <wp:wrapNone/>
-            <wp:docPr id="17" name="Imagen 17"/>
-            <wp:cNvGraphicFramePr>
-              <a:graphicFrameLocks xmlns:a="http://schemas.openxmlformats.org/drawingml/2006/main" noChangeAspect="1"/>
-            </wp:cNvGraphicFramePr>
-            <a:graphic xmlns:a="http://schemas.openxmlformats.org/drawingml/2006/main">
-              <a:graphicData uri="http://schemas.openxmlformats.org/drawingml/2006/picture">
-                <pic:pic xmlns:pic="http://schemas.openxmlformats.org/drawingml/2006/picture">
-                  <pic:nvPicPr>
-                    <pic:cNvPr id="0" name="Picture 5"/>
                     <pic:cNvPicPr>
                       <a:picLocks noChangeAspect="1" noChangeArrowheads="1"/>
                     </pic:cNvPicPr>
@@ -2519,19 +2574,26 @@
             </wp14:sizeRelV>
           </wp:anchor>
         </w:drawing>
+      </w:r>
+    </w:p>
+    <w:p>
+      <w:r>
+        <w:rPr>
+          <w:noProof/>
+        </w:rPr>
         <w:drawing>
-          <wp:anchor distT="0" distB="0" distL="114300" distR="114300" simplePos="0" relativeHeight="251672576" behindDoc="0" locked="0" layoutInCell="1" allowOverlap="1" wp14:anchorId="7F9E12E7" wp14:editId="0E04E50A">
+          <wp:anchor distT="0" distB="0" distL="114300" distR="114300" simplePos="0" relativeHeight="251674624" behindDoc="0" locked="0" layoutInCell="1" allowOverlap="1" wp14:anchorId="719CE79B" wp14:editId="2FDADA0F">
             <wp:simplePos x="0" y="0"/>
             <wp:positionH relativeFrom="column">
-              <wp:posOffset>-3810</wp:posOffset>
+              <wp:posOffset>3787140</wp:posOffset>
             </wp:positionH>
             <wp:positionV relativeFrom="paragraph">
-              <wp:posOffset>635</wp:posOffset>
+              <wp:posOffset>10160</wp:posOffset>
             </wp:positionV>
-            <wp:extent cx="1620000" cy="3510000"/>
+            <wp:extent cx="1619885" cy="3509645"/>
             <wp:effectExtent l="152400" t="152400" r="361315" b="357505"/>
             <wp:wrapNone/>
-            <wp:docPr id="15" name="Imagen 15"/>
+            <wp:docPr id="17" name="Imagen 17"/>
             <wp:cNvGraphicFramePr>
               <a:graphicFrameLocks xmlns:a="http://schemas.openxmlformats.org/drawingml/2006/main" noChangeAspect="1"/>
             </wp:cNvGraphicFramePr>
@@ -2539,7 +2601,7 @@
               <a:graphicData uri="http://schemas.openxmlformats.org/drawingml/2006/picture">
                 <pic:pic xmlns:pic="http://schemas.openxmlformats.org/drawingml/2006/picture">
                   <pic:nvPicPr>
-                    <pic:cNvPr id="0" name="Picture 3"/>
+                    <pic:cNvPr id="0" name="Picture 5"/>
                     <pic:cNvPicPr>
                       <a:picLocks noChangeAspect="1" noChangeArrowheads="1"/>
                     </pic:cNvPicPr>
@@ -2560,7 +2622,7 @@
                   <pic:spPr bwMode="auto">
                     <a:xfrm>
                       <a:off x="0" y="0"/>
-                      <a:ext cx="1620000" cy="3510000"/>
+                      <a:ext cx="1619885" cy="3509645"/>
                     </a:xfrm>
                     <a:prstGeom prst="rect">
                       <a:avLst/>
@@ -2588,121 +2650,23 @@
           </wp:anchor>
         </w:drawing>
       </w:r>
-    </w:p>
-    <w:p/>
-    <w:p/>
-    <w:p/>
-    <w:p/>
-    <w:p/>
-    <w:p/>
-    <w:p/>
-    <w:p/>
-    <w:p/>
-    <w:p/>
-    <w:p/>
-    <w:p/>
-    <w:p/>
-    <w:p/>
-    <w:p/>
-    <w:p/>
-    <w:p/>
-    <w:p>
-      <w:pPr>
-        <w:pStyle w:val="Prrafodelista"/>
-        <w:numPr>
-          <w:ilvl w:val="0"/>
-          <w:numId w:val="15"/>
-        </w:numPr>
-        <w:rPr>
-          <w:b/>
-          <w:bCs/>
-          <w:lang w:eastAsia="es-MX"/>
-        </w:rPr>
-      </w:pPr>
-      <w:r>
-        <w:rPr>
-          <w:b/>
-          <w:bCs/>
-          <w:lang w:eastAsia="es-MX"/>
-        </w:rPr>
-        <w:lastRenderedPageBreak/>
-        <w:t>Diseñar interfaz con animaciones:</w:t>
-      </w:r>
-    </w:p>
-    <w:p>
-      <w:r>
-        <w:t xml:space="preserve">La interfaz fue desarrollada utilizando </w:t>
-      </w:r>
-      <w:r>
-        <w:rPr>
-          <w:b/>
-          <w:bCs/>
-        </w:rPr>
-        <w:t xml:space="preserve">Jetpack Compose</w:t>
-      </w:r>
-      <w:r>
-        <w:t xml:space="preserve"> y </w:t>
-      </w:r>
-      <w:r>
-        <w:rPr>
-          <w:b/>
-          <w:bCs/>
-        </w:rPr>
-        <w:t>Material 3</w:t>
-      </w:r>
-      <w:r>
-        <w:t>.</w:t>
-      </w:r>
-    </w:p>
-    <w:p>
-      <w:r>
-        <w:t xml:space="preserve">Se implementó una animación para que las notas aparezcan de manera visual al agregarse. Para esto se utilizó AnimatedVisibility, combinando animaciones de desplazamiento horizontal y aparición gradual mediante slideInHorizontally y fadeIn.</w:t>
-      </w:r>
-    </w:p>
-    <w:p>
-      <w:r>
-        <w:t>Esto permite que la aplicación tenga una interacción más dinámica al momento de agregar una nota.</w:t>
-      </w:r>
-    </w:p>
-    <w:p>
-      <w:pPr>
-        <w:rPr>
-          <w:lang w:eastAsia="es-MX"/>
-        </w:rPr>
-      </w:pPr>
-      <w:r>
-        <w:t xml:space="preserve">Además de la animación de entrada, se reforzaron otras animaciones: al agregar, eliminar o filtrar notas (por ejemplo, al buscar), las tarjetas restantes se reacomodan con una animación de posición en vez de saltar de golpe a su nuevo lugar.</w:t>
-      </w:r>
-    </w:p>
-    <w:p>
-      <w:pPr>
-        <w:rPr>
-          <w:lang w:eastAsia="es-MX"/>
-        </w:rPr>
-      </w:pPr>
-      <w:r>
-        <w:t xml:space="preserve">También se agregó una animación de escala al presionar una tarjeta (retroalimentación visual del toque) y una transición entre la lista de notas y el estado vacío.</w:t>
-      </w:r>
-    </w:p>
-    <w:p/>
-    <w:p>
       <w:r>
         <w:rPr>
           <w:noProof/>
         </w:rPr>
         <w:drawing>
-          <wp:anchor distT="0" distB="0" distL="114300" distR="114300" simplePos="0" relativeHeight="251675648" behindDoc="0" locked="0" layoutInCell="1" allowOverlap="1" wp14:anchorId="7D756EA5" wp14:editId="0D33D426">
+          <wp:anchor distT="0" distB="0" distL="114300" distR="114300" simplePos="0" relativeHeight="251672576" behindDoc="0" locked="0" layoutInCell="1" allowOverlap="1" wp14:anchorId="7F9E12E7" wp14:editId="0E04E50A">
             <wp:simplePos x="0" y="0"/>
             <wp:positionH relativeFrom="column">
               <wp:posOffset>-3810</wp:posOffset>
             </wp:positionH>
             <wp:positionV relativeFrom="paragraph">
-              <wp:posOffset>-3810</wp:posOffset>
+              <wp:posOffset>635</wp:posOffset>
             </wp:positionV>
             <wp:extent cx="1620000" cy="3510000"/>
             <wp:effectExtent l="152400" t="152400" r="361315" b="357505"/>
             <wp:wrapNone/>
-            <wp:docPr id="19" name="Imagen 19"/>
+            <wp:docPr id="15" name="Imagen 15"/>
             <wp:cNvGraphicFramePr>
               <a:graphicFrameLocks xmlns:a="http://schemas.openxmlformats.org/drawingml/2006/main" noChangeAspect="1"/>
             </wp:cNvGraphicFramePr>
@@ -2710,7 +2674,7 @@
               <a:graphicData uri="http://schemas.openxmlformats.org/drawingml/2006/picture">
                 <pic:pic xmlns:pic="http://schemas.openxmlformats.org/drawingml/2006/picture">
                   <pic:nvPicPr>
-                    <pic:cNvPr id="0" name="Picture 6"/>
+                    <pic:cNvPr id="0" name="Picture 3"/>
                     <pic:cNvPicPr>
                       <a:picLocks noChangeAspect="1" noChangeArrowheads="1"/>
                     </pic:cNvPicPr>
@@ -2777,9 +2741,6 @@
     <w:p/>
     <w:p/>
     <w:p/>
-    <w:p/>
-    <w:p/>
-    <w:p/>
     <w:p>
       <w:pPr>
         <w:pStyle w:val="Prrafodelista"/>
@@ -2799,33 +2760,63 @@
           <w:bCs/>
           <w:lang w:eastAsia="es-MX"/>
         </w:rPr>
+        <w:t>Diseñar interfaz con animaciones:</w:t>
+      </w:r>
+    </w:p>
+    <w:p>
+      <w:r>
+        <w:t xml:space="preserve">La interfaz fue desarrollada utilizando </w:t>
+      </w:r>
+      <w:r>
+        <w:rPr>
+          <w:b/>
+          <w:bCs/>
+        </w:rPr>
+        <w:t>Jetpack Compose</w:t>
+      </w:r>
+      <w:r>
+        <w:t xml:space="preserve"> y </w:t>
+      </w:r>
+      <w:r>
+        <w:rPr>
+          <w:b/>
+          <w:bCs/>
+        </w:rPr>
+        <w:t>Material 3</w:t>
+      </w:r>
+      <w:r>
+        <w:t>.</w:t>
+      </w:r>
+    </w:p>
+    <w:p>
+      <w:r>
+        <w:t>Se implementó una animación para que las notas aparezcan de manera visual al agregarse. Para esto se utilizó AnimatedVisibility, combinando animaciones de desplazamiento horizontal y aparición gradual mediante slideInHorizontally y fadeIn.</w:t>
+      </w:r>
+    </w:p>
+    <w:p>
+      <w:r>
         <w:lastRenderedPageBreak/>
-        <w:t>Añadir gestos:</w:t>
-      </w:r>
-    </w:p>
-    <w:p>
-      <w:r>
-        <w:t xml:space="preserve">Se implementó un gesto de </w:t>
-      </w:r>
-      <w:r>
-        <w:rPr>
-          <w:b/>
-          <w:bCs/>
-        </w:rPr>
-        <w:t>deslizamiento (swipe</w:t>
-      </w:r>
-      <w:r>
-        <w:t>) para eliminar las notas.</w:t>
-      </w:r>
-    </w:p>
-    <w:p>
-      <w:r>
-        <w:t xml:space="preserve">El usuario puede deslizar una nota hacia un lado para eliminarla. En la versión implementada se utiliza SwipeToDismissBox, que permite realizar esta acción de manera sencilla dentro de Jetpack Compose.</w:t>
-      </w:r>
-    </w:p>
-    <w:p>
-      <w:r>
-        <w:t>Esta función facilita la interacción del usuario y evita tener que agregar un botón adicional para eliminar cada nota.</w:t>
+        <w:t>Esto permite que la aplicación tenga una interacción más dinámica al momento de agregar una nota.</w:t>
+      </w:r>
+    </w:p>
+    <w:p>
+      <w:pPr>
+        <w:rPr>
+          <w:lang w:eastAsia="es-MX"/>
+        </w:rPr>
+      </w:pPr>
+      <w:r>
+        <w:t>Además de la animación de entrada, se reforzaron otras animaciones: al agregar, eliminar o filtrar notas (por ejemplo, al buscar), las tarjetas restantes se reacomodan con una animación de posición en vez de saltar de golpe a su nuevo lugar.</w:t>
+      </w:r>
+    </w:p>
+    <w:p>
+      <w:pPr>
+        <w:rPr>
+          <w:lang w:eastAsia="es-MX"/>
+        </w:rPr>
+      </w:pPr>
+      <w:r>
+        <w:t>También se agregó una animación de escala al presionar una tarjeta (retroalimentación visual del toque) y una transición entre la lista de notas y el estado vacío.</w:t>
       </w:r>
     </w:p>
     <w:p/>
@@ -2835,18 +2826,18 @@
           <w:noProof/>
         </w:rPr>
         <w:drawing>
-          <wp:anchor distT="0" distB="0" distL="114300" distR="114300" simplePos="0" relativeHeight="251676672" behindDoc="0" locked="0" layoutInCell="1" allowOverlap="1" wp14:anchorId="1A912AF6" wp14:editId="12E8EF5F">
+          <wp:anchor distT="0" distB="0" distL="114300" distR="114300" simplePos="0" relativeHeight="251675648" behindDoc="0" locked="0" layoutInCell="1" allowOverlap="1" wp14:anchorId="7D756EA5" wp14:editId="0D33D426">
             <wp:simplePos x="0" y="0"/>
             <wp:positionH relativeFrom="column">
               <wp:posOffset>-3810</wp:posOffset>
             </wp:positionH>
             <wp:positionV relativeFrom="paragraph">
-              <wp:posOffset>1905</wp:posOffset>
+              <wp:posOffset>-3810</wp:posOffset>
             </wp:positionV>
             <wp:extent cx="1620000" cy="3510000"/>
             <wp:effectExtent l="152400" t="152400" r="361315" b="357505"/>
             <wp:wrapNone/>
-            <wp:docPr id="20" name="Imagen 20"/>
+            <wp:docPr id="19" name="Imagen 19"/>
             <wp:cNvGraphicFramePr>
               <a:graphicFrameLocks xmlns:a="http://schemas.openxmlformats.org/drawingml/2006/main" noChangeAspect="1"/>
             </wp:cNvGraphicFramePr>
@@ -2854,7 +2845,7 @@
               <a:graphicData uri="http://schemas.openxmlformats.org/drawingml/2006/picture">
                 <pic:pic xmlns:pic="http://schemas.openxmlformats.org/drawingml/2006/picture">
                   <pic:nvPicPr>
-                    <pic:cNvPr id="0" name="Picture 7"/>
+                    <pic:cNvPr id="0" name="Picture 6"/>
                     <pic:cNvPicPr>
                       <a:picLocks noChangeAspect="1" noChangeArrowheads="1"/>
                     </pic:cNvPicPr>
@@ -2904,70 +2895,93 @@
         </w:drawing>
       </w:r>
     </w:p>
-    <w:p>
-      <w:pPr>
-        <w:pageBreakBefore/>
-        <w:rPr>
-          <w:lang w:eastAsia="es-MX"/>
-        </w:rPr>
-      </w:pPr>
-      <w:r>
-        <w:t xml:space="preserve">Además del swipe, se agregó un segundo gesto: una </w:t>
-      </w:r>
-      <w:r>
-        <w:rPr>
-          <w:b/>
-          <w:bCs/>
-        </w:rPr>
-        <w:t xml:space="preserve">pulsación larga</w:t>
-      </w:r>
-      <w:r>
-        <w:t xml:space="preserve"> sobre una nota abre una vista de lectura a pantalla completa con </w:t>
-      </w:r>
-      <w:r>
-        <w:rPr>
-          <w:b/>
-          <w:bCs/>
-        </w:rPr>
-        <w:t xml:space="preserve">zoom de pellizco</w:t>
-      </w:r>
-      <w:r>
-        <w:t xml:space="preserve"> (pinch-to-zoom), pensada para notas con texto largo o letra pequeña.</w:t>
-      </w:r>
-    </w:p>
-    <w:p>
-      <w:pPr>
-        <w:rPr>
-          <w:lang w:eastAsia="es-MX"/>
-        </w:rPr>
-      </w:pPr>
-      <w:r>
-        <w:t xml:space="preserve">Al pellizcar con dos dedos sobre el texto este se agranda o achica (detectTransformGestures), y con doble toque se restablece el tamaño original. El tap normal sigue abriendo "Editar nota" como antes; el zoom no interfiere con eso.</w:t>
-      </w:r>
-    </w:p>
-    <w:p>
-      <w:pPr>
-        <w:rPr>
-          <w:lang w:eastAsia="es-MX"/>
-        </w:rPr>
-      </w:pPr>
+    <w:p/>
+    <w:p/>
+    <w:p/>
+    <w:p/>
+    <w:p/>
+    <w:p/>
+    <w:p/>
+    <w:p/>
+    <w:p/>
+    <w:p/>
+    <w:p/>
+    <w:p/>
+    <w:p/>
+    <w:p/>
+    <w:p/>
+    <w:p/>
+    <w:p/>
+    <w:p/>
+    <w:p/>
+    <w:p/>
+    <w:p>
+      <w:pPr>
+        <w:pStyle w:val="Prrafodelista"/>
+        <w:numPr>
+          <w:ilvl w:val="0"/>
+          <w:numId w:val="15"/>
+        </w:numPr>
+        <w:rPr>
+          <w:b/>
+          <w:bCs/>
+          <w:lang w:eastAsia="es-MX"/>
+        </w:rPr>
+      </w:pPr>
+      <w:r>
+        <w:rPr>
+          <w:b/>
+          <w:bCs/>
+          <w:lang w:eastAsia="es-MX"/>
+        </w:rPr>
+        <w:lastRenderedPageBreak/>
+        <w:t>Añadir gestos:</w:t>
+      </w:r>
+    </w:p>
+    <w:p>
+      <w:r>
+        <w:t xml:space="preserve">Se implementó un gesto de </w:t>
+      </w:r>
+      <w:r>
+        <w:rPr>
+          <w:b/>
+          <w:bCs/>
+        </w:rPr>
+        <w:t>deslizamiento (swipe</w:t>
+      </w:r>
+      <w:r>
+        <w:t>) para eliminar las notas.</w:t>
+      </w:r>
+    </w:p>
+    <w:p>
+      <w:r>
+        <w:t>El usuario puede deslizar una nota hacia un lado para eliminarla. En la versión implementada se utiliza SwipeToDismissBox, que permite realizar esta acción de manera sencilla dentro de Jetpack Compose.</w:t>
+      </w:r>
+    </w:p>
+    <w:p>
+      <w:r>
+        <w:t>Esta función facilita la interacción del usuario y evita tener que agregar un botón adicional para eliminar cada nota.</w:t>
+      </w:r>
+    </w:p>
+    <w:p/>
+    <w:p>
       <w:r>
         <w:rPr>
           <w:noProof/>
         </w:rPr>
         <w:drawing>
-          <wp:anchor distT="0" distB="0" distL="114300" distR="114300" simplePos="0" relativeHeight="251680200" behindDoc="0" locked="0" layoutInCell="1" allowOverlap="1" wp14:anchorId="AA100003" wp14:editId="AB100003">
+          <wp:anchor distT="0" distB="0" distL="114300" distR="114300" simplePos="0" relativeHeight="251676672" behindDoc="0" locked="0" layoutInCell="1" allowOverlap="1" wp14:anchorId="1A912AF6" wp14:editId="12E8EF5F">
             <wp:simplePos x="0" y="0"/>
             <wp:positionH relativeFrom="column">
               <wp:posOffset>-3810</wp:posOffset>
             </wp:positionH>
             <wp:positionV relativeFrom="paragraph">
-              <wp:posOffset>0</wp:posOffset>
+              <wp:posOffset>1905</wp:posOffset>
             </wp:positionV>
             <wp:extent cx="1620000" cy="3510000"/>
             <wp:effectExtent l="152400" t="152400" r="361315" b="357505"/>
             <wp:wrapNone/>
-            <wp:docPr id="103" name="Imagen 103"/>
+            <wp:docPr id="20" name="Imagen 20"/>
             <wp:cNvGraphicFramePr>
               <a:graphicFrameLocks xmlns:a="http://schemas.openxmlformats.org/drawingml/2006/main" noChangeAspect="1"/>
             </wp:cNvGraphicFramePr>
@@ -2975,13 +2989,13 @@
               <a:graphicData uri="http://schemas.openxmlformats.org/drawingml/2006/picture">
                 <pic:pic xmlns:pic="http://schemas.openxmlformats.org/drawingml/2006/picture">
                   <pic:nvPicPr>
-                    <pic:cNvPr id="0" name="Imagen 103"/>
+                    <pic:cNvPr id="0" name="Picture 7"/>
                     <pic:cNvPicPr>
                       <a:picLocks noChangeAspect="1" noChangeArrowheads="1"/>
                     </pic:cNvPicPr>
                   </pic:nvPicPr>
                   <pic:blipFill>
-                    <a:blip r:embed="rId25" cstate="print">
+                    <a:blip r:embed="rId22" cstate="print">
                       <a:extLst>
                         <a:ext uri="{28A0092B-C50C-407E-A947-70E740481C1C}">
                           <a14:useLocalDpi xmlns:a14="http://schemas.microsoft.com/office/drawing/2010/main" val="0"/>
@@ -3025,6 +3039,128 @@
         </w:drawing>
       </w:r>
     </w:p>
+    <w:p>
+      <w:pPr>
+        <w:pageBreakBefore/>
+        <w:rPr>
+          <w:lang w:eastAsia="es-MX"/>
+        </w:rPr>
+      </w:pPr>
+      <w:r>
+        <w:lastRenderedPageBreak/>
+        <w:t xml:space="preserve">Además del swipe, se agregó un segundo gesto: una </w:t>
+      </w:r>
+      <w:r>
+        <w:rPr>
+          <w:b/>
+          <w:bCs/>
+        </w:rPr>
+        <w:t>pulsación larga</w:t>
+      </w:r>
+      <w:r>
+        <w:t xml:space="preserve"> sobre una nota abre una vista de lectura a pantalla completa con </w:t>
+      </w:r>
+      <w:r>
+        <w:rPr>
+          <w:b/>
+          <w:bCs/>
+        </w:rPr>
+        <w:t>zoom de pellizco</w:t>
+      </w:r>
+      <w:r>
+        <w:t xml:space="preserve"> (pinch-to-zoom), pensada para notas con texto largo o letra pequeña.</w:t>
+      </w:r>
+    </w:p>
+    <w:p>
+      <w:pPr>
+        <w:rPr>
+          <w:lang w:eastAsia="es-MX"/>
+        </w:rPr>
+      </w:pPr>
+      <w:r>
+        <w:t>Al pellizcar con dos dedos sobre el texto este se agranda o achica (detectTransformGestures), y con doble toque se restablece el tamaño original. El tap normal sigue abriendo "Editar nota" como antes; el zoom no interfiere con eso.</w:t>
+      </w:r>
+    </w:p>
+    <w:p>
+      <w:pPr>
+        <w:rPr>
+          <w:lang w:eastAsia="es-MX"/>
+        </w:rPr>
+      </w:pPr>
+      <w:r>
+        <w:rPr>
+          <w:noProof/>
+        </w:rPr>
+        <w:drawing>
+          <wp:anchor distT="0" distB="0" distL="114300" distR="114300" simplePos="0" relativeHeight="251680200" behindDoc="0" locked="0" layoutInCell="1" allowOverlap="1" wp14:anchorId="AA100003" wp14:editId="4B3CC749">
+            <wp:simplePos x="0" y="0"/>
+            <wp:positionH relativeFrom="column">
+              <wp:posOffset>-3810</wp:posOffset>
+            </wp:positionH>
+            <wp:positionV relativeFrom="paragraph">
+              <wp:posOffset>0</wp:posOffset>
+            </wp:positionV>
+            <wp:extent cx="1620000" cy="3510000"/>
+            <wp:effectExtent l="152400" t="152400" r="361315" b="357505"/>
+            <wp:wrapNone/>
+            <wp:docPr id="103" name="Imagen 103"/>
+            <wp:cNvGraphicFramePr>
+              <a:graphicFrameLocks xmlns:a="http://schemas.openxmlformats.org/drawingml/2006/main" noChangeAspect="1"/>
+            </wp:cNvGraphicFramePr>
+            <a:graphic xmlns:a="http://schemas.openxmlformats.org/drawingml/2006/main">
+              <a:graphicData uri="http://schemas.openxmlformats.org/drawingml/2006/picture">
+                <pic:pic xmlns:pic="http://schemas.openxmlformats.org/drawingml/2006/picture">
+                  <pic:nvPicPr>
+                    <pic:cNvPr id="0" name="Imagen 103"/>
+                    <pic:cNvPicPr>
+                      <a:picLocks noChangeAspect="1" noChangeArrowheads="1"/>
+                    </pic:cNvPicPr>
+                  </pic:nvPicPr>
+                  <pic:blipFill>
+                    <a:blip r:embed="rId23" cstate="print">
+                      <a:extLst>
+                        <a:ext uri="{28A0092B-C50C-407E-A947-70E740481C1C}">
+                          <a14:useLocalDpi xmlns:a14="http://schemas.microsoft.com/office/drawing/2010/main" val="0"/>
+                        </a:ext>
+                      </a:extLst>
+                    </a:blip>
+                    <a:srcRect/>
+                    <a:stretch>
+                      <a:fillRect/>
+                    </a:stretch>
+                  </pic:blipFill>
+                  <pic:spPr bwMode="auto">
+                    <a:xfrm>
+                      <a:off x="0" y="0"/>
+                      <a:ext cx="1620000" cy="3510000"/>
+                    </a:xfrm>
+                    <a:prstGeom prst="rect">
+                      <a:avLst/>
+                    </a:prstGeom>
+                    <a:ln>
+                      <a:noFill/>
+                    </a:ln>
+                    <a:effectLst>
+                      <a:outerShdw blurRad="292100" dist="139700" dir="2700000" algn="tl" rotWithShape="0">
+                        <a:srgbClr val="333333">
+                          <a:alpha val="65000"/>
+                        </a:srgbClr>
+                      </a:outerShdw>
+                    </a:effectLst>
+                  </pic:spPr>
+                </pic:pic>
+              </a:graphicData>
+            </a:graphic>
+            <wp14:sizeRelH relativeFrom="page">
+              <wp14:pctWidth>0</wp14:pctWidth>
+            </wp14:sizeRelH>
+            <wp14:sizeRelV relativeFrom="page">
+              <wp14:pctHeight>0</wp14:pctHeight>
+            </wp14:sizeRelV>
+          </wp:anchor>
+        </w:drawing>
+      </w:r>
+    </w:p>
     <w:p/>
     <w:p/>
     <w:p/>
@@ -3066,6 +3202,7 @@
           <w:bCs/>
           <w:lang w:eastAsia="es-MX"/>
         </w:rPr>
+        <w:lastRenderedPageBreak/>
         <w:t>Diseño responsivo:</w:t>
       </w:r>
     </w:p>
@@ -3076,14 +3213,14 @@
         </w:rPr>
       </w:pPr>
       <w:r>
-        <w:t xml:space="preserve">La pantalla de notas se implementó con una cuadrícula adaptable (</w:t>
-      </w:r>
-      <w:r>
-        <w:rPr>
-          <w:b/>
-          <w:bCs/>
-        </w:rPr>
-        <w:t xml:space="preserve">LazyVerticalStaggeredGrid</w:t>
+        <w:t>La pantalla de notas se implementó con una cuadrícula adaptable (</w:t>
+      </w:r>
+      <w:r>
+        <w:rPr>
+          <w:b/>
+          <w:bCs/>
+        </w:rPr>
+        <w:t>LazyVerticalStaggeredGrid</w:t>
       </w:r>
       <w:r>
         <w:t xml:space="preserve"> con </w:t>
@@ -3093,40 +3230,40 @@
           <w:b/>
           <w:bCs/>
         </w:rPr>
-        <w:t xml:space="preserve">StaggeredGridCells.Adaptive</w:t>
-      </w:r>
-      <w:r>
-        <w:t xml:space="preserve">) en lugar de una lista de una sola columna fija.</w:t>
-      </w:r>
-    </w:p>
-    <w:p>
-      <w:pPr>
-        <w:rPr>
-          <w:lang w:eastAsia="es-MX"/>
-        </w:rPr>
-      </w:pPr>
-      <w:r>
-        <w:t xml:space="preserve">El número de columnas se recalcula solo, según el ancho disponible: una columna en un teléfono en vertical, y varias columnas al girar a horizontal o en una pantalla más grande (tablet), sin necesidad de escribir lógica distinta para cada tamaño de dispositivo.</w:t>
-      </w:r>
-    </w:p>
-    <w:p>
-      <w:pPr>
-        <w:rPr>
-          <w:lang w:eastAsia="es-MX"/>
-        </w:rPr>
-      </w:pPr>
-      <w:r>
-        <w:t xml:space="preserve">Esto se verificó en un emulador: con las mismas notas, la cuadrícula pasa de 2 columnas en vertical a 5 columnas al rotar a horizontal.</w:t>
-      </w:r>
-    </w:p>
-    <w:p>
-      <w:pPr>
-        <w:rPr>
-          <w:lang w:eastAsia="es-MX"/>
-        </w:rPr>
-      </w:pPr>
-      <w:r>
-        <w:t xml:space="preserve">Vista vertical (2 columnas):</w:t>
+        <w:t>StaggeredGridCells.Adaptive</w:t>
+      </w:r>
+      <w:r>
+        <w:t>) en lugar de una lista de una sola columna fija.</w:t>
+      </w:r>
+    </w:p>
+    <w:p>
+      <w:pPr>
+        <w:rPr>
+          <w:lang w:eastAsia="es-MX"/>
+        </w:rPr>
+      </w:pPr>
+      <w:r>
+        <w:t>El número de columnas se recalcula solo, según el ancho disponible: una columna en un teléfono en vertical, y varias columnas al girar a horizontal o en una pantalla más grande (tablet), sin necesidad de escribir lógica distinta para cada tamaño de dispositivo.</w:t>
+      </w:r>
+    </w:p>
+    <w:p>
+      <w:pPr>
+        <w:rPr>
+          <w:lang w:eastAsia="es-MX"/>
+        </w:rPr>
+      </w:pPr>
+      <w:r>
+        <w:t>Esto se verificó en un emulador: con las mismas notas, la cuadrícula pasa de 2 columnas en vertical a 5 columnas al rotar a horizontal.</w:t>
+      </w:r>
+    </w:p>
+    <w:p>
+      <w:pPr>
+        <w:rPr>
+          <w:lang w:eastAsia="es-MX"/>
+        </w:rPr>
+      </w:pPr>
+      <w:r>
+        <w:t>Vista vertical (2 columnas):</w:t>
       </w:r>
     </w:p>
     <w:p>
@@ -3140,7 +3277,7 @@
           <w:noProof/>
         </w:rPr>
         <w:drawing>
-          <wp:anchor distT="0" distB="0" distL="114300" distR="114300" simplePos="0" relativeHeight="251680000" behindDoc="0" locked="0" layoutInCell="1" allowOverlap="1" wp14:anchorId="AA100001" wp14:editId="AB100001">
+          <wp:anchor distT="0" distB="0" distL="114300" distR="114300" simplePos="0" relativeHeight="251680000" behindDoc="0" locked="0" layoutInCell="1" allowOverlap="1" wp14:anchorId="AA100001" wp14:editId="24AE3BE7">
             <wp:simplePos x="0" y="0"/>
             <wp:positionH relativeFrom="column">
               <wp:posOffset>-3810</wp:posOffset>
@@ -3160,6 +3297,395 @@
                 <pic:pic xmlns:pic="http://schemas.openxmlformats.org/drawingml/2006/picture">
                   <pic:nvPicPr>
                     <pic:cNvPr id="0" name="Imagen 101"/>
+                    <pic:cNvPicPr>
+                      <a:picLocks noChangeAspect="1" noChangeArrowheads="1"/>
+                    </pic:cNvPicPr>
+                  </pic:nvPicPr>
+                  <pic:blipFill>
+                    <a:blip r:embed="rId24" cstate="print">
+                      <a:extLst>
+                        <a:ext uri="{28A0092B-C50C-407E-A947-70E740481C1C}">
+                          <a14:useLocalDpi xmlns:a14="http://schemas.microsoft.com/office/drawing/2010/main" val="0"/>
+                        </a:ext>
+                      </a:extLst>
+                    </a:blip>
+                    <a:srcRect/>
+                    <a:stretch>
+                      <a:fillRect/>
+                    </a:stretch>
+                  </pic:blipFill>
+                  <pic:spPr bwMode="auto">
+                    <a:xfrm>
+                      <a:off x="0" y="0"/>
+                      <a:ext cx="1620000" cy="3510000"/>
+                    </a:xfrm>
+                    <a:prstGeom prst="rect">
+                      <a:avLst/>
+                    </a:prstGeom>
+                    <a:ln>
+                      <a:noFill/>
+                    </a:ln>
+                    <a:effectLst>
+                      <a:outerShdw blurRad="292100" dist="139700" dir="2700000" algn="tl" rotWithShape="0">
+                        <a:srgbClr val="333333">
+                          <a:alpha val="65000"/>
+                        </a:srgbClr>
+                      </a:outerShdw>
+                    </a:effectLst>
+                  </pic:spPr>
+                </pic:pic>
+              </a:graphicData>
+            </a:graphic>
+            <wp14:sizeRelH relativeFrom="page">
+              <wp14:pctWidth>0</wp14:pctWidth>
+            </wp14:sizeRelH>
+            <wp14:sizeRelV relativeFrom="page">
+              <wp14:pctHeight>0</wp14:pctHeight>
+            </wp14:sizeRelV>
+          </wp:anchor>
+        </w:drawing>
+      </w:r>
+    </w:p>
+    <w:p>
+      <w:pPr>
+        <w:pageBreakBefore/>
+        <w:rPr>
+          <w:lang w:eastAsia="es-MX"/>
+        </w:rPr>
+      </w:pPr>
+      <w:r>
+        <w:lastRenderedPageBreak/>
+        <w:t>Misma pantalla, en horizontal (5 columnas):</w:t>
+      </w:r>
+    </w:p>
+    <w:p>
+      <w:pPr>
+        <w:rPr>
+          <w:lang w:eastAsia="es-MX"/>
+        </w:rPr>
+      </w:pPr>
+      <w:r>
+        <w:rPr>
+          <w:noProof/>
+        </w:rPr>
+        <w:drawing>
+          <wp:anchor distT="0" distB="0" distL="114300" distR="114300" simplePos="0" relativeHeight="251680100" behindDoc="0" locked="0" layoutInCell="1" allowOverlap="1" wp14:anchorId="AA100002" wp14:editId="6AE3151F">
+            <wp:simplePos x="0" y="0"/>
+            <wp:positionH relativeFrom="column">
+              <wp:posOffset>-3810</wp:posOffset>
+            </wp:positionH>
+            <wp:positionV relativeFrom="paragraph">
+              <wp:posOffset>0</wp:posOffset>
+            </wp:positionV>
+            <wp:extent cx="3600000" cy="1620000"/>
+            <wp:effectExtent l="152400" t="152400" r="361315" b="357505"/>
+            <wp:wrapNone/>
+            <wp:docPr id="102" name="Imagen 102"/>
+            <wp:cNvGraphicFramePr>
+              <a:graphicFrameLocks xmlns:a="http://schemas.openxmlformats.org/drawingml/2006/main" noChangeAspect="1"/>
+            </wp:cNvGraphicFramePr>
+            <a:graphic xmlns:a="http://schemas.openxmlformats.org/drawingml/2006/main">
+              <a:graphicData uri="http://schemas.openxmlformats.org/drawingml/2006/picture">
+                <pic:pic xmlns:pic="http://schemas.openxmlformats.org/drawingml/2006/picture">
+                  <pic:nvPicPr>
+                    <pic:cNvPr id="0" name="Imagen 102"/>
+                    <pic:cNvPicPr>
+                      <a:picLocks noChangeAspect="1" noChangeArrowheads="1"/>
+                    </pic:cNvPicPr>
+                  </pic:nvPicPr>
+                  <pic:blipFill>
+                    <a:blip r:embed="rId25" cstate="print">
+                      <a:extLst>
+                        <a:ext uri="{28A0092B-C50C-407E-A947-70E740481C1C}">
+                          <a14:useLocalDpi xmlns:a14="http://schemas.microsoft.com/office/drawing/2010/main" val="0"/>
+                        </a:ext>
+                      </a:extLst>
+                    </a:blip>
+                    <a:srcRect/>
+                    <a:stretch>
+                      <a:fillRect/>
+                    </a:stretch>
+                  </pic:blipFill>
+                  <pic:spPr bwMode="auto">
+                    <a:xfrm>
+                      <a:off x="0" y="0"/>
+                      <a:ext cx="3600000" cy="1620000"/>
+                    </a:xfrm>
+                    <a:prstGeom prst="rect">
+                      <a:avLst/>
+                    </a:prstGeom>
+                    <a:ln>
+                      <a:noFill/>
+                    </a:ln>
+                    <a:effectLst>
+                      <a:outerShdw blurRad="292100" dist="139700" dir="2700000" algn="tl" rotWithShape="0">
+                        <a:srgbClr val="333333">
+                          <a:alpha val="65000"/>
+                        </a:srgbClr>
+                      </a:outerShdw>
+                    </a:effectLst>
+                  </pic:spPr>
+                </pic:pic>
+              </a:graphicData>
+            </a:graphic>
+            <wp14:sizeRelH relativeFrom="page">
+              <wp14:pctWidth>0</wp14:pctWidth>
+            </wp14:sizeRelH>
+            <wp14:sizeRelV relativeFrom="page">
+              <wp14:pctHeight>0</wp14:pctHeight>
+            </wp14:sizeRelV>
+          </wp:anchor>
+        </w:drawing>
+      </w:r>
+    </w:p>
+    <w:p/>
+    <w:p>
+      <w:pPr>
+        <w:pStyle w:val="Prrafodelista"/>
+        <w:pageBreakBefore/>
+        <w:numPr>
+          <w:ilvl w:val="0"/>
+          <w:numId w:val="15"/>
+        </w:numPr>
+        <w:rPr>
+          <w:b/>
+          <w:bCs/>
+          <w:lang w:eastAsia="es-MX"/>
+        </w:rPr>
+      </w:pPr>
+      <w:r>
+        <w:rPr>
+          <w:b/>
+          <w:bCs/>
+          <w:lang w:eastAsia="es-MX"/>
+        </w:rPr>
+        <w:lastRenderedPageBreak/>
+        <w:t>Pruebas y ajustes:</w:t>
+      </w:r>
+    </w:p>
+    <w:p>
+      <w:pPr>
+        <w:rPr>
+          <w:lang w:eastAsia="es-MX"/>
+        </w:rPr>
+      </w:pPr>
+      <w:r>
+        <w:rPr>
+          <w:lang w:eastAsia="es-MX"/>
+        </w:rPr>
+        <w:t>Finalmente, se realizaron pruebas para comprobar el correcto funcionamiento de la aplicación.</w:t>
+      </w:r>
+    </w:p>
+    <w:p>
+      <w:pPr>
+        <w:rPr>
+          <w:lang w:eastAsia="es-MX"/>
+        </w:rPr>
+      </w:pPr>
+      <w:r>
+        <w:rPr>
+          <w:lang w:eastAsia="es-MX"/>
+        </w:rPr>
+        <w:t>Se verificó principalmente:</w:t>
+      </w:r>
+    </w:p>
+    <w:p>
+      <w:pPr>
+        <w:pStyle w:val="Prrafodelista"/>
+        <w:numPr>
+          <w:ilvl w:val="0"/>
+          <w:numId w:val="25"/>
+        </w:numPr>
+        <w:rPr>
+          <w:lang w:eastAsia="es-MX"/>
+        </w:rPr>
+      </w:pPr>
+      <w:r>
+        <w:rPr>
+          <w:lang w:eastAsia="es-MX"/>
+        </w:rPr>
+        <w:t>Creación de nuevas notas.</w:t>
+      </w:r>
+    </w:p>
+    <w:p>
+      <w:pPr>
+        <w:pStyle w:val="Prrafodelista"/>
+        <w:numPr>
+          <w:ilvl w:val="0"/>
+          <w:numId w:val="25"/>
+        </w:numPr>
+        <w:rPr>
+          <w:lang w:eastAsia="es-MX"/>
+        </w:rPr>
+      </w:pPr>
+      <w:r>
+        <w:rPr>
+          <w:lang w:eastAsia="es-MX"/>
+        </w:rPr>
+        <w:t>Visualización de las notas almacenadas.</w:t>
+      </w:r>
+    </w:p>
+    <w:p>
+      <w:pPr>
+        <w:pStyle w:val="Prrafodelista"/>
+        <w:numPr>
+          <w:ilvl w:val="0"/>
+          <w:numId w:val="25"/>
+        </w:numPr>
+        <w:rPr>
+          <w:lang w:eastAsia="es-MX"/>
+        </w:rPr>
+      </w:pPr>
+      <w:r>
+        <w:rPr>
+          <w:lang w:eastAsia="es-MX"/>
+        </w:rPr>
+        <w:t>Edición de notas.</w:t>
+      </w:r>
+    </w:p>
+    <w:p>
+      <w:pPr>
+        <w:pStyle w:val="Prrafodelista"/>
+        <w:numPr>
+          <w:ilvl w:val="0"/>
+          <w:numId w:val="25"/>
+        </w:numPr>
+        <w:rPr>
+          <w:lang w:eastAsia="es-MX"/>
+        </w:rPr>
+      </w:pPr>
+      <w:r>
+        <w:rPr>
+          <w:lang w:eastAsia="es-MX"/>
+        </w:rPr>
+        <w:t>Eliminación mediante el gesto de swipe.</w:t>
+      </w:r>
+    </w:p>
+    <w:p>
+      <w:pPr>
+        <w:pStyle w:val="Prrafodelista"/>
+        <w:numPr>
+          <w:ilvl w:val="0"/>
+          <w:numId w:val="25"/>
+        </w:numPr>
+        <w:rPr>
+          <w:lang w:eastAsia="es-MX"/>
+        </w:rPr>
+      </w:pPr>
+      <w:r>
+        <w:rPr>
+          <w:lang w:eastAsia="es-MX"/>
+        </w:rPr>
+        <w:t>Zoom con pellizco (pulsación larga sobre una nota) para leer el contenido ampliado.</w:t>
+      </w:r>
+    </w:p>
+    <w:p>
+      <w:pPr>
+        <w:pStyle w:val="Prrafodelista"/>
+        <w:numPr>
+          <w:ilvl w:val="0"/>
+          <w:numId w:val="25"/>
+        </w:numPr>
+        <w:rPr>
+          <w:lang w:eastAsia="es-MX"/>
+        </w:rPr>
+      </w:pPr>
+      <w:r>
+        <w:rPr>
+          <w:lang w:eastAsia="es-MX"/>
+        </w:rPr>
+        <w:t>Reacomodo de la cuadrícula al girar el dispositivo (de 2 a 5 columnas con las mismas notas).</w:t>
+      </w:r>
+    </w:p>
+    <w:p>
+      <w:pPr>
+        <w:pStyle w:val="Prrafodelista"/>
+        <w:numPr>
+          <w:ilvl w:val="0"/>
+          <w:numId w:val="25"/>
+        </w:numPr>
+        <w:rPr>
+          <w:lang w:eastAsia="es-MX"/>
+        </w:rPr>
+      </w:pPr>
+      <w:r>
+        <w:rPr>
+          <w:lang w:eastAsia="es-MX"/>
+        </w:rPr>
+        <w:t>Persistencia de los datos después de cerrar y volver a abrir la aplicación.</w:t>
+      </w:r>
+    </w:p>
+    <w:p>
+      <w:pPr>
+        <w:pStyle w:val="Prrafodelista"/>
+        <w:numPr>
+          <w:ilvl w:val="0"/>
+          <w:numId w:val="25"/>
+        </w:numPr>
+        <w:rPr>
+          <w:lang w:eastAsia="es-MX"/>
+        </w:rPr>
+      </w:pPr>
+      <w:r>
+        <w:rPr>
+          <w:lang w:eastAsia="es-MX"/>
+        </w:rPr>
+        <w:t>Funcionamiento en emulador o dispositivo Android.</w:t>
+      </w:r>
+    </w:p>
+    <w:p>
+      <w:pPr>
+        <w:rPr>
+          <w:lang w:eastAsia="es-MX"/>
+        </w:rPr>
+      </w:pPr>
+      <w:r>
+        <w:rPr>
+          <w:lang w:eastAsia="es-MX"/>
+        </w:rPr>
+        <w:t>También se implementaron pruebas unitarias e instrumentadas para comprobar el funcionamiento de los conversores y las operaciones de la base de datos.</w:t>
+      </w:r>
+    </w:p>
+    <w:p>
+      <w:pPr>
+        <w:rPr>
+          <w:lang w:eastAsia="es-MX"/>
+        </w:rPr>
+      </w:pPr>
+      <w:r>
+        <w:rPr>
+          <w:lang w:eastAsia="es-MX"/>
+        </w:rPr>
+        <w:t>Además, se utilizó una herramienta de inteligencia artificial como apoyo durante el desarrollo para revisar código, resolver errores y verificar posibles soluciones.</w:t>
+      </w:r>
+    </w:p>
+    <w:p/>
+    <w:p>
+      <w:r>
+        <w:rPr>
+          <w:noProof/>
+        </w:rPr>
+        <w:drawing>
+          <wp:anchor distT="0" distB="0" distL="114300" distR="114300" simplePos="0" relativeHeight="251677696" behindDoc="0" locked="0" layoutInCell="1" allowOverlap="1" wp14:anchorId="3F7F2AF2" wp14:editId="6E10371C">
+            <wp:simplePos x="0" y="0"/>
+            <wp:positionH relativeFrom="column">
+              <wp:posOffset>-3810</wp:posOffset>
+            </wp:positionH>
+            <wp:positionV relativeFrom="paragraph">
+              <wp:posOffset>0</wp:posOffset>
+            </wp:positionV>
+            <wp:extent cx="1620000" cy="3510000"/>
+            <wp:effectExtent l="152400" t="152400" r="361315" b="357505"/>
+            <wp:wrapNone/>
+            <wp:docPr id="21" name="Imagen 21"/>
+            <wp:cNvGraphicFramePr>
+              <a:graphicFrameLocks xmlns:a="http://schemas.openxmlformats.org/drawingml/2006/main" noChangeAspect="1"/>
+            </wp:cNvGraphicFramePr>
+            <a:graphic xmlns:a="http://schemas.openxmlformats.org/drawingml/2006/main">
+              <a:graphicData uri="http://schemas.openxmlformats.org/drawingml/2006/picture">
+                <pic:pic xmlns:pic="http://schemas.openxmlformats.org/drawingml/2006/picture">
+                  <pic:nvPicPr>
+                    <pic:cNvPr id="0" name="Picture 8"/>
                     <pic:cNvPicPr>
                       <a:picLocks noChangeAspect="1" noChangeArrowheads="1"/>
                     </pic:cNvPicPr>
@@ -3209,394 +3735,6 @@
         </w:drawing>
       </w:r>
     </w:p>
-    <w:p>
-      <w:pPr>
-        <w:pageBreakBefore/>
-        <w:rPr>
-          <w:lang w:eastAsia="es-MX"/>
-        </w:rPr>
-      </w:pPr>
-      <w:r>
-        <w:t xml:space="preserve">Misma pantalla, en horizontal (5 columnas):</w:t>
-      </w:r>
-    </w:p>
-    <w:p>
-      <w:pPr>
-        <w:rPr>
-          <w:lang w:eastAsia="es-MX"/>
-        </w:rPr>
-      </w:pPr>
-      <w:r>
-        <w:rPr>
-          <w:noProof/>
-        </w:rPr>
-        <w:drawing>
-          <wp:anchor distT="0" distB="0" distL="114300" distR="114300" simplePos="0" relativeHeight="251680100" behindDoc="0" locked="0" layoutInCell="1" allowOverlap="1" wp14:anchorId="AA100002" wp14:editId="AB100002">
-            <wp:simplePos x="0" y="0"/>
-            <wp:positionH relativeFrom="column">
-              <wp:posOffset>-3810</wp:posOffset>
-            </wp:positionH>
-            <wp:positionV relativeFrom="paragraph">
-              <wp:posOffset>0</wp:posOffset>
-            </wp:positionV>
-            <wp:extent cx="3600000" cy="1620000"/>
-            <wp:effectExtent l="152400" t="152400" r="361315" b="357505"/>
-            <wp:wrapNone/>
-            <wp:docPr id="102" name="Imagen 102"/>
-            <wp:cNvGraphicFramePr>
-              <a:graphicFrameLocks xmlns:a="http://schemas.openxmlformats.org/drawingml/2006/main" noChangeAspect="1"/>
-            </wp:cNvGraphicFramePr>
-            <a:graphic xmlns:a="http://schemas.openxmlformats.org/drawingml/2006/main">
-              <a:graphicData uri="http://schemas.openxmlformats.org/drawingml/2006/picture">
-                <pic:pic xmlns:pic="http://schemas.openxmlformats.org/drawingml/2006/picture">
-                  <pic:nvPicPr>
-                    <pic:cNvPr id="0" name="Imagen 102"/>
-                    <pic:cNvPicPr>
-                      <a:picLocks noChangeAspect="1" noChangeArrowheads="1"/>
-                    </pic:cNvPicPr>
-                  </pic:nvPicPr>
-                  <pic:blipFill>
-                    <a:blip r:embed="rId27" cstate="print">
-                      <a:extLst>
-                        <a:ext uri="{28A0092B-C50C-407E-A947-70E740481C1C}">
-                          <a14:useLocalDpi xmlns:a14="http://schemas.microsoft.com/office/drawing/2010/main" val="0"/>
-                        </a:ext>
-                      </a:extLst>
-                    </a:blip>
-                    <a:srcRect/>
-                    <a:stretch>
-                      <a:fillRect/>
-                    </a:stretch>
-                  </pic:blipFill>
-                  <pic:spPr bwMode="auto">
-                    <a:xfrm>
-                      <a:off x="0" y="0"/>
-                      <a:ext cx="3600000" cy="1620000"/>
-                    </a:xfrm>
-                    <a:prstGeom prst="rect">
-                      <a:avLst/>
-                    </a:prstGeom>
-                    <a:ln>
-                      <a:noFill/>
-                    </a:ln>
-                    <a:effectLst>
-                      <a:outerShdw blurRad="292100" dist="139700" dir="2700000" algn="tl" rotWithShape="0">
-                        <a:srgbClr val="333333">
-                          <a:alpha val="65000"/>
-                        </a:srgbClr>
-                      </a:outerShdw>
-                    </a:effectLst>
-                  </pic:spPr>
-                </pic:pic>
-              </a:graphicData>
-            </a:graphic>
-            <wp14:sizeRelH relativeFrom="page">
-              <wp14:pctWidth>0</wp14:pctWidth>
-            </wp14:sizeRelH>
-            <wp14:sizeRelV relativeFrom="page">
-              <wp14:pctHeight>0</wp14:pctHeight>
-            </wp14:sizeRelV>
-          </wp:anchor>
-        </w:drawing>
-      </w:r>
-    </w:p>
-    <w:p/>
-    <w:p>
-      <w:pPr>
-        <w:pStyle w:val="Prrafodelista"/>
-        <w:pageBreakBefore/>
-        <w:numPr>
-          <w:ilvl w:val="0"/>
-          <w:numId w:val="15"/>
-        </w:numPr>
-        <w:rPr>
-          <w:b/>
-          <w:bCs/>
-          <w:lang w:eastAsia="es-MX"/>
-        </w:rPr>
-      </w:pPr>
-      <w:r>
-        <w:rPr>
-          <w:b/>
-          <w:bCs/>
-          <w:lang w:eastAsia="es-MX"/>
-        </w:rPr>
-        <w:lastRenderedPageBreak/>
-        <w:t>Pruebas y ajustes:</w:t>
-      </w:r>
-    </w:p>
-    <w:p>
-      <w:pPr>
-        <w:rPr>
-          <w:lang w:eastAsia="es-MX"/>
-        </w:rPr>
-      </w:pPr>
-      <w:r>
-        <w:rPr>
-          <w:lang w:eastAsia="es-MX"/>
-        </w:rPr>
-        <w:t>Finalmente, se realizaron pruebas para comprobar el correcto funcionamiento de la aplicación.</w:t>
-      </w:r>
-    </w:p>
-    <w:p>
-      <w:pPr>
-        <w:rPr>
-          <w:lang w:eastAsia="es-MX"/>
-        </w:rPr>
-      </w:pPr>
-      <w:r>
-        <w:rPr>
-          <w:lang w:eastAsia="es-MX"/>
-        </w:rPr>
-        <w:t>Se verificó principalmente:</w:t>
-      </w:r>
-    </w:p>
-    <w:p>
-      <w:pPr>
-        <w:pStyle w:val="Prrafodelista"/>
-        <w:numPr>
-          <w:ilvl w:val="0"/>
-          <w:numId w:val="25"/>
-        </w:numPr>
-        <w:rPr>
-          <w:lang w:eastAsia="es-MX"/>
-        </w:rPr>
-      </w:pPr>
-      <w:r>
-        <w:rPr>
-          <w:lang w:eastAsia="es-MX"/>
-        </w:rPr>
-        <w:t>Creación de nuevas notas.</w:t>
-      </w:r>
-    </w:p>
-    <w:p>
-      <w:pPr>
-        <w:pStyle w:val="Prrafodelista"/>
-        <w:numPr>
-          <w:ilvl w:val="0"/>
-          <w:numId w:val="25"/>
-        </w:numPr>
-        <w:rPr>
-          <w:lang w:eastAsia="es-MX"/>
-        </w:rPr>
-      </w:pPr>
-      <w:r>
-        <w:rPr>
-          <w:lang w:eastAsia="es-MX"/>
-        </w:rPr>
-        <w:t>Visualización de las notas almacenadas.</w:t>
-      </w:r>
-    </w:p>
-    <w:p>
-      <w:pPr>
-        <w:pStyle w:val="Prrafodelista"/>
-        <w:numPr>
-          <w:ilvl w:val="0"/>
-          <w:numId w:val="25"/>
-        </w:numPr>
-        <w:rPr>
-          <w:lang w:eastAsia="es-MX"/>
-        </w:rPr>
-      </w:pPr>
-      <w:r>
-        <w:rPr>
-          <w:lang w:eastAsia="es-MX"/>
-        </w:rPr>
-        <w:t>Edición de notas.</w:t>
-      </w:r>
-    </w:p>
-    <w:p>
-      <w:pPr>
-        <w:pStyle w:val="Prrafodelista"/>
-        <w:numPr>
-          <w:ilvl w:val="0"/>
-          <w:numId w:val="25"/>
-        </w:numPr>
-        <w:rPr>
-          <w:lang w:eastAsia="es-MX"/>
-        </w:rPr>
-      </w:pPr>
-      <w:r>
-        <w:rPr>
-          <w:lang w:eastAsia="es-MX"/>
-        </w:rPr>
-        <w:t xml:space="preserve">Eliminación mediante el gesto de swipe.</w:t>
-      </w:r>
-    </w:p>
-    <w:p>
-      <w:pPr>
-        <w:pStyle w:val="Prrafodelista"/>
-        <w:numPr>
-          <w:ilvl w:val="0"/>
-          <w:numId w:val="25"/>
-        </w:numPr>
-        <w:rPr>
-          <w:lang w:eastAsia="es-MX"/>
-        </w:rPr>
-      </w:pPr>
-      <w:r>
-        <w:rPr>
-          <w:lang w:eastAsia="es-MX"/>
-        </w:rPr>
-        <w:t>Zoom con pellizco (pulsación larga sobre una nota) para leer el contenido ampliado.</w:t>
-      </w:r>
-    </w:p>
-    <w:p>
-      <w:pPr>
-        <w:pStyle w:val="Prrafodelista"/>
-        <w:numPr>
-          <w:ilvl w:val="0"/>
-          <w:numId w:val="25"/>
-        </w:numPr>
-        <w:rPr>
-          <w:lang w:eastAsia="es-MX"/>
-        </w:rPr>
-      </w:pPr>
-      <w:r>
-        <w:rPr>
-          <w:lang w:eastAsia="es-MX"/>
-        </w:rPr>
-        <w:t>Reacomodo de la cuadrícula al girar el dispositivo (de 2 a 5 columnas con las mismas notas).</w:t>
-      </w:r>
-    </w:p>
-    <w:p>
-      <w:pPr>
-        <w:pStyle w:val="Prrafodelista"/>
-        <w:numPr>
-          <w:ilvl w:val="0"/>
-          <w:numId w:val="25"/>
-        </w:numPr>
-        <w:rPr>
-          <w:lang w:eastAsia="es-MX"/>
-        </w:rPr>
-      </w:pPr>
-      <w:r>
-        <w:rPr>
-          <w:lang w:eastAsia="es-MX"/>
-        </w:rPr>
-        <w:t>Persistencia de los datos después de cerrar y volver a abrir la aplicación.</w:t>
-      </w:r>
-    </w:p>
-    <w:p>
-      <w:pPr>
-        <w:pStyle w:val="Prrafodelista"/>
-        <w:numPr>
-          <w:ilvl w:val="0"/>
-          <w:numId w:val="25"/>
-        </w:numPr>
-        <w:rPr>
-          <w:lang w:eastAsia="es-MX"/>
-        </w:rPr>
-      </w:pPr>
-      <w:r>
-        <w:rPr>
-          <w:lang w:eastAsia="es-MX"/>
-        </w:rPr>
-        <w:t>Funcionamiento en emulador o dispositivo Android.</w:t>
-      </w:r>
-    </w:p>
-    <w:p>
-      <w:pPr>
-        <w:rPr>
-          <w:lang w:eastAsia="es-MX"/>
-        </w:rPr>
-      </w:pPr>
-      <w:r>
-        <w:rPr>
-          <w:lang w:eastAsia="es-MX"/>
-        </w:rPr>
-        <w:t>También se implementaron pruebas unitarias e instrumentadas para comprobar el funcionamiento de los conversores y las operaciones de la base de datos.</w:t>
-      </w:r>
-    </w:p>
-    <w:p>
-      <w:pPr>
-        <w:rPr>
-          <w:lang w:eastAsia="es-MX"/>
-        </w:rPr>
-      </w:pPr>
-      <w:r>
-        <w:rPr>
-          <w:lang w:eastAsia="es-MX"/>
-        </w:rPr>
-        <w:t>Además, se utilizó una herramienta de inteligencia artificial como apoyo durante el desarrollo para revisar código, resolver errores y verificar posibles soluciones.</w:t>
-      </w:r>
-    </w:p>
-    <w:p/>
-    <w:p>
-      <w:r>
-        <w:rPr>
-          <w:noProof/>
-        </w:rPr>
-        <w:drawing>
-          <wp:anchor distT="0" distB="0" distL="114300" distR="114300" simplePos="0" relativeHeight="251677696" behindDoc="0" locked="0" layoutInCell="1" allowOverlap="1" wp14:anchorId="3F7F2AF2" wp14:editId="6E10371C">
-            <wp:simplePos x="0" y="0"/>
-            <wp:positionH relativeFrom="column">
-              <wp:posOffset>-3810</wp:posOffset>
-            </wp:positionH>
-            <wp:positionV relativeFrom="paragraph">
-              <wp:posOffset>0</wp:posOffset>
-            </wp:positionV>
-            <wp:extent cx="1620000" cy="3510000"/>
-            <wp:effectExtent l="152400" t="152400" r="361315" b="357505"/>
-            <wp:wrapNone/>
-            <wp:docPr id="21" name="Imagen 21"/>
-            <wp:cNvGraphicFramePr>
-              <a:graphicFrameLocks xmlns:a="http://schemas.openxmlformats.org/drawingml/2006/main" noChangeAspect="1"/>
-            </wp:cNvGraphicFramePr>
-            <a:graphic xmlns:a="http://schemas.openxmlformats.org/drawingml/2006/main">
-              <a:graphicData uri="http://schemas.openxmlformats.org/drawingml/2006/picture">
-                <pic:pic xmlns:pic="http://schemas.openxmlformats.org/drawingml/2006/picture">
-                  <pic:nvPicPr>
-                    <pic:cNvPr id="0" name="Picture 8"/>
-                    <pic:cNvPicPr>
-                      <a:picLocks noChangeAspect="1" noChangeArrowheads="1"/>
-                    </pic:cNvPicPr>
-                  </pic:nvPicPr>
-                  <pic:blipFill>
-                    <a:blip r:embed="rId22" cstate="print">
-                      <a:extLst>
-                        <a:ext uri="{28A0092B-C50C-407E-A947-70E740481C1C}">
-                          <a14:useLocalDpi xmlns:a14="http://schemas.microsoft.com/office/drawing/2010/main" val="0"/>
-                        </a:ext>
-                      </a:extLst>
-                    </a:blip>
-                    <a:srcRect/>
-                    <a:stretch>
-                      <a:fillRect/>
-                    </a:stretch>
-                  </pic:blipFill>
-                  <pic:spPr bwMode="auto">
-                    <a:xfrm>
-                      <a:off x="0" y="0"/>
-                      <a:ext cx="1620000" cy="3510000"/>
-                    </a:xfrm>
-                    <a:prstGeom prst="rect">
-                      <a:avLst/>
-                    </a:prstGeom>
-                    <a:ln>
-                      <a:noFill/>
-                    </a:ln>
-                    <a:effectLst>
-                      <a:outerShdw blurRad="292100" dist="139700" dir="2700000" algn="tl" rotWithShape="0">
-                        <a:srgbClr val="333333">
-                          <a:alpha val="65000"/>
-                        </a:srgbClr>
-                      </a:outerShdw>
-                    </a:effectLst>
-                  </pic:spPr>
-                </pic:pic>
-              </a:graphicData>
-            </a:graphic>
-            <wp14:sizeRelH relativeFrom="page">
-              <wp14:pctWidth>0</wp14:pctWidth>
-            </wp14:sizeRelH>
-            <wp14:sizeRelV relativeFrom="page">
-              <wp14:pctHeight>0</wp14:pctHeight>
-            </wp14:sizeRelV>
-          </wp:anchor>
-        </w:drawing>
-      </w:r>
-    </w:p>
     <w:sectPr>
       <w:pgSz w:w="12240" w:h="15840"/>
       <w:pgMar w:top="1417" w:right="1701" w:bottom="1417" w:left="1701" w:header="708" w:footer="708" w:gutter="0"/>
@@ -3614,7 +3752,7 @@
 </file>
 
 <file path=word/numbering.xml><?xml version="1.0" encoding="utf-8"?>
-<w:numbering xmlns:wpc="http://schemas.microsoft.com/office/word/2010/wordprocessingCanvas" xmlns:cx="http://schemas.microsoft.com/office/drawing/2014/chartex" xmlns:cx1="http://schemas.microsoft.com/office/drawing/2015/9/8/chartex" xmlns:cx2="http://schemas.microsoft.com/office/drawing/2015/10/21/chartex" xmlns:cx3="http://schemas.microsoft.com/office/drawing/2016/5/9/chartex" xmlns:cx4="http://schemas.microsoft.com/office/drawing/2016/5/10/chartex" xmlns:cx5="http://schemas.microsoft.com/office/drawing/2016/5/11/chartex" xmlns:cx6="http://schemas.microsoft.com/office/drawing/2016/5/12/chartex" xmlns:cx7="http://schemas.microsoft.com/office/drawing/2016/5/13/chartex" xmlns:cx8="http://schemas.microsoft.com/office/drawing/2016/5/14/chartex" xmlns:mc="http://schemas.openxmlformats.org/markup-compatibility/2006" xmlns:aink="http://schemas.microsoft.com/office/drawing/2016/ink" xmlns:am3d="http://schemas.microsoft.com/office/drawing/2017/model3d" xmlns:o="urn:schemas-microsoft-com:office:office" xmlns:oel="http://schemas.microsoft.com/office/2019/extlst" xmlns:r="http://schemas.openxmlformats.org/officeDocument/2006/relationships" xmlns:m="http://schemas.openxmlformats.org/officeDocument/2006/math" xmlns:v="urn:schemas-microsoft-com:vml" xmlns:wp14="http://schemas.microsoft.com/office/word/2010/wordprocessingDrawing" xmlns:wp="http://schemas.openxmlformats.org/drawingml/2006/wordprocessingDrawing" xmlns:w10="urn:schemas-microsoft-com:office:word" xmlns:w="http://schemas.openxmlformats.org/wordprocessingml/2006/main" xmlns:w14="http://schemas.microsoft.com/office/word/2010/wordml" xmlns:w15="http://schemas.microsoft.com/office/word/2012/wordml" xmlns:w16cex="http://schemas.microsoft.com/office/word/2018/wordml/cex" xmlns:w16cid="http://schemas.microsoft.com/office/word/2016/wordml/cid" xmlns:w16="http://schemas.microsoft.com/office/word/2018/wordml" xmlns:w16sdtdh="http://schemas.microsoft.com/office/word/2020/wordml/sdtdatahash" xmlns:w16se="http://schemas.microsoft.com/office/word/2015/wordml/symex" xmlns:wpg="http://schemas.microsoft.com/office/word/2010/wordprocessingGroup" xmlns:wpi="http://schemas.microsoft.com/office/word/2010/wordprocessingInk" xmlns:wne="http://schemas.microsoft.com/office/word/2006/wordml" xmlns:wps="http://schemas.microsoft.com/office/word/2010/wordprocessingShape" mc:Ignorable="w14 w15 w16se w16cid w16 w16cex w16sdtdh wp14">
+<w:numbering xmlns:wpc="http://schemas.microsoft.com/office/word/2010/wordprocessingCanvas" xmlns:cx="http://schemas.microsoft.com/office/drawing/2014/chartex" xmlns:cx1="http://schemas.microsoft.com/office/drawing/2015/9/8/chartex" xmlns:cx2="http://schemas.microsoft.com/office/drawing/2015/10/21/chartex" xmlns:cx3="http://schemas.microsoft.com/office/drawing/2016/5/9/chartex" xmlns:cx4="http://schemas.microsoft.com/office/drawing/2016/5/10/chartex" xmlns:cx5="http://schemas.microsoft.com/office/drawing/2016/5/11/chartex" xmlns:cx6="http://schemas.microsoft.com/office/drawing/2016/5/12/chartex" xmlns:cx7="http://schemas.microsoft.com/office/drawing/2016/5/13/chartex" xmlns:cx8="http://schemas.microsoft.com/office/drawing/2016/5/14/chartex" xmlns:mc="http://schemas.openxmlformats.org/markup-compatibility/2006" xmlns:aink="http://schemas.microsoft.com/office/drawing/2016/ink" xmlns:am3d="http://schemas.microsoft.com/office/drawing/2017/model3d" xmlns:o="urn:schemas-microsoft-com:office:office" xmlns:oel="http://schemas.microsoft.com/office/2019/extlst" xmlns:r="http://schemas.openxmlformats.org/officeDocument/2006/relationships" xmlns:m="http://schemas.openxmlformats.org/officeDocument/2006/math" xmlns:v="urn:schemas-microsoft-com:vml" xmlns:wp14="http://schemas.microsoft.com/office/word/2010/wordprocessingDrawing" xmlns:wp="http://schemas.openxmlformats.org/drawingml/2006/wordprocessingDrawing" xmlns:w10="urn:schemas-microsoft-com:office:word" xmlns:w="http://schemas.openxmlformats.org/wordprocessingml/2006/main" xmlns:w14="http://schemas.microsoft.com/office/word/2010/wordml" xmlns:w15="http://schemas.microsoft.com/office/word/2012/wordml" xmlns:w16cex="http://schemas.microsoft.com/office/word/2018/wordml/cex" xmlns:w16cid="http://schemas.microsoft.com/office/word/2016/wordml/cid" xmlns:w16="http://schemas.microsoft.com/office/word/2018/wordml" xmlns:w16du="http://schemas.microsoft.com/office/word/2023/wordml/word16du" xmlns:w16sdtdh="http://schemas.microsoft.com/office/word/2020/wordml/sdtdatahash" xmlns:w16sdtfl="http://schemas.microsoft.com/office/word/2024/wordml/sdtformatlock" xmlns:w16se="http://schemas.microsoft.com/office/word/2015/wordml/symex" xmlns:wpg="http://schemas.microsoft.com/office/word/2010/wordprocessingGroup" xmlns:wpi="http://schemas.microsoft.com/office/word/2010/wordprocessingInk" xmlns:wne="http://schemas.microsoft.com/office/word/2006/wordml" xmlns:wps="http://schemas.microsoft.com/office/word/2010/wordprocessingShape" mc:Ignorable="w14 w15 w16se w16cid w16 w16cex w16sdtdh w16sdtfl w16du wp14">
   <w:abstractNum w:abstractNumId="0" w15:restartNumberingAfterBreak="0">
     <w:nsid w:val="03C676CA"/>
     <w:multiLevelType w:val="hybridMultilevel"/>
@@ -6521,7 +6659,7 @@
 </file>
 
 <file path=word/styles.xml><?xml version="1.0" encoding="utf-8"?>
-<w:styles xmlns:mc="http://schemas.openxmlformats.org/markup-compatibility/2006" xmlns:r="http://schemas.openxmlformats.org/officeDocument/2006/relationships" xmlns:w="http://schemas.openxmlformats.org/wordprocessingml/2006/main" xmlns:w14="http://schemas.microsoft.com/office/word/2010/wordml" xmlns:w15="http://schemas.microsoft.com/office/word/2012/wordml" xmlns:w16cex="http://schemas.microsoft.com/office/word/2018/wordml/cex" xmlns:w16cid="http://schemas.microsoft.com/office/word/2016/wordml/cid" xmlns:w16="http://schemas.microsoft.com/office/word/2018/wordml" xmlns:w16sdtdh="http://schemas.microsoft.com/office/word/2020/wordml/sdtdatahash" xmlns:w16se="http://schemas.microsoft.com/office/word/2015/wordml/symex" mc:Ignorable="w14 w15 w16se w16cid w16 w16cex w16sdtdh">
+<w:styles xmlns:mc="http://schemas.openxmlformats.org/markup-compatibility/2006" xmlns:r="http://schemas.openxmlformats.org/officeDocument/2006/relationships" xmlns:w="http://schemas.openxmlformats.org/wordprocessingml/2006/main" xmlns:w14="http://schemas.microsoft.com/office/word/2010/wordml" xmlns:w15="http://schemas.microsoft.com/office/word/2012/wordml" xmlns:w16cex="http://schemas.microsoft.com/office/word/2018/wordml/cex" xmlns:w16cid="http://schemas.microsoft.com/office/word/2016/wordml/cid" xmlns:w16="http://schemas.microsoft.com/office/word/2018/wordml" xmlns:w16du="http://schemas.microsoft.com/office/word/2023/wordml/word16du" xmlns:w16sdtdh="http://schemas.microsoft.com/office/word/2020/wordml/sdtdatahash" xmlns:w16sdtfl="http://schemas.microsoft.com/office/word/2024/wordml/sdtformatlock" xmlns:w16se="http://schemas.microsoft.com/office/word/2015/wordml/symex" mc:Ignorable="w14 w15 w16se w16cid w16 w16cex w16sdtdh w16sdtfl w16du">
   <w:docDefaults>
     <w:rPrDefault>
       <w:rPr>
@@ -7026,7 +7164,7 @@
       <w14:ligatures w14:val="none"/>
     </w:rPr>
   </w:style>
-  <w:style w:type="character" w:styleId="Textoennegrita">
+  <w:style w:type="character" w:styleId="Fuerte">
     <w:name w:val="Strong"/>
     <w:basedOn w:val="Fuentedeprrafopredeter"/>
     <w:uiPriority w:val="22"/>

</xml_diff>

<commit_message>
Quitar mencion de pantallas sin su captura en la seccion de Figma
Se removio la frase que hacia referencia a una captura de pantalla
que nunca se inserto ("Pantalla de inicio con notas y sin notas"),
dejando el flujo de lectura limpio. PDF regenerado en consecuencia.

Co-Authored-By: Claude Sonnet 5 <noreply@anthropic.com>
</commit_message>
<xml_diff>
--- a/Documentación/Actividad 4 Tec (App Movil).docx
+++ b/Documentación/Actividad 4 Tec (App Movil).docx
@@ -1939,20 +1939,8 @@
           <w:sz w:val="32"/>
           <w:szCs w:val="28"/>
         </w:rPr>
-        <w:t xml:space="preserve">Diseño – Prototipo en </w:t>
-      </w:r>
-      <w:proofErr w:type="spellStart"/>
-      <w:r>
-        <w:rPr>
-          <w:b/>
-          <w:bCs/>
-          <w:color w:val="ED7D31" w:themeColor="accent2"/>
-          <w:sz w:val="32"/>
-          <w:szCs w:val="28"/>
-        </w:rPr>
-        <w:t>Figma</w:t>
-      </w:r>
-      <w:proofErr w:type="spellEnd"/>
+        <w:t>Diseño – Prototipo en Figma</w:t>
+      </w:r>
     </w:p>
     <w:p>
       <w:pPr>
@@ -2023,30 +2011,16 @@
       </w:r>
     </w:p>
     <w:p>
-      <w:r>
+      <w:pPr>
+        <w:rPr>
+          <w:lang w:eastAsia="es-MX"/>
+        </w:rPr>
+      </w:pPr>
+      <w:r>
+        <w:rPr>
+          <w:lang w:eastAsia="es-MX"/>
+        </w:rPr>
         <w:lastRenderedPageBreak/>
-        <w:t xml:space="preserve">A continuación, el orden de las pantallas por orden de experiencia de usuario: Pantalla de inicio con notas y sin notas: </w:t>
-      </w:r>
-    </w:p>
-    <w:p>
-      <w:pPr>
-        <w:rPr>
-          <w:b/>
-          <w:bCs/>
-          <w:lang w:eastAsia="es-MX"/>
-        </w:rPr>
-      </w:pPr>
-    </w:p>
-    <w:p>
-      <w:pPr>
-        <w:rPr>
-          <w:lang w:eastAsia="es-MX"/>
-        </w:rPr>
-      </w:pPr>
-      <w:r>
-        <w:rPr>
-          <w:lang w:eastAsia="es-MX"/>
-        </w:rPr>
         <w:t xml:space="preserve">Para el desarrollo de la aplicación se creó un proyecto en </w:t>
       </w:r>
       <w:r>
@@ -2451,53 +2425,53 @@
           <w:bCs/>
           <w:lang w:eastAsia="es-MX"/>
         </w:rPr>
+        <w:t>Eliminar:</w:t>
+      </w:r>
+      <w:r>
+        <w:rPr>
+          <w:lang w:eastAsia="es-MX"/>
+        </w:rPr>
+        <w:t xml:space="preserve"> permite eliminar una nota.</w:t>
+      </w:r>
+    </w:p>
+    <w:p>
+      <w:pPr>
+        <w:rPr>
+          <w:lang w:eastAsia="es-MX"/>
+        </w:rPr>
+      </w:pPr>
+      <w:r>
+        <w:rPr>
+          <w:lang w:eastAsia="es-MX"/>
+        </w:rPr>
+        <w:t xml:space="preserve">Para gestionar estas operaciones se utilizó </w:t>
+      </w:r>
+      <w:r>
+        <w:rPr>
+          <w:b/>
+          <w:bCs/>
+          <w:lang w:eastAsia="es-MX"/>
+        </w:rPr>
+        <w:t>RoomDatabase</w:t>
+      </w:r>
+      <w:r>
+        <w:rPr>
+          <w:lang w:eastAsia="es-MX"/>
+        </w:rPr>
+        <w:t>, un Repository y un ViewModel. El NoteDao se encarga de realizar las operaciones directamente sobre la base de datos.</w:t>
+      </w:r>
+    </w:p>
+    <w:p>
+      <w:pPr>
+        <w:rPr>
+          <w:lang w:eastAsia="es-MX"/>
+        </w:rPr>
+      </w:pPr>
+      <w:r>
+        <w:rPr>
+          <w:lang w:eastAsia="es-MX"/>
+        </w:rPr>
         <w:lastRenderedPageBreak/>
-        <w:t>Eliminar:</w:t>
-      </w:r>
-      <w:r>
-        <w:rPr>
-          <w:lang w:eastAsia="es-MX"/>
-        </w:rPr>
-        <w:t xml:space="preserve"> permite eliminar una nota.</w:t>
-      </w:r>
-    </w:p>
-    <w:p>
-      <w:pPr>
-        <w:rPr>
-          <w:lang w:eastAsia="es-MX"/>
-        </w:rPr>
-      </w:pPr>
-      <w:r>
-        <w:rPr>
-          <w:lang w:eastAsia="es-MX"/>
-        </w:rPr>
-        <w:t xml:space="preserve">Para gestionar estas operaciones se utilizó </w:t>
-      </w:r>
-      <w:r>
-        <w:rPr>
-          <w:b/>
-          <w:bCs/>
-          <w:lang w:eastAsia="es-MX"/>
-        </w:rPr>
-        <w:t>RoomDatabase</w:t>
-      </w:r>
-      <w:r>
-        <w:rPr>
-          <w:lang w:eastAsia="es-MX"/>
-        </w:rPr>
-        <w:t>, un Repository y un ViewModel. El NoteDao se encarga de realizar las operaciones directamente sobre la base de datos.</w:t>
-      </w:r>
-    </w:p>
-    <w:p>
-      <w:pPr>
-        <w:rPr>
-          <w:lang w:eastAsia="es-MX"/>
-        </w:rPr>
-      </w:pPr>
-      <w:r>
-        <w:rPr>
-          <w:lang w:eastAsia="es-MX"/>
-        </w:rPr>
         <w:t>La información se obtiene mediante Flow, permitiendo que los cambios realizados en la base de datos se reflejen automáticamente en la interfaz.</w:t>
       </w:r>
     </w:p>
@@ -2795,18 +2769,21 @@
     </w:p>
     <w:p>
       <w:r>
+        <w:t>Esto permite que la aplicación tenga una interacción más dinámica al momento de agregar una nota.</w:t>
+      </w:r>
+    </w:p>
+    <w:p>
+      <w:pPr>
+        <w:rPr>
+          <w:lang w:eastAsia="es-MX"/>
+        </w:rPr>
+      </w:pPr>
+      <w:r>
+        <w:t xml:space="preserve">Además de la animación de entrada, se reforzaron otras animaciones: al agregar, eliminar o filtrar notas (por ejemplo, al buscar), las tarjetas restantes se </w:t>
+      </w:r>
+      <w:r>
         <w:lastRenderedPageBreak/>
-        <w:t>Esto permite que la aplicación tenga una interacción más dinámica al momento de agregar una nota.</w:t>
-      </w:r>
-    </w:p>
-    <w:p>
-      <w:pPr>
-        <w:rPr>
-          <w:lang w:eastAsia="es-MX"/>
-        </w:rPr>
-      </w:pPr>
-      <w:r>
-        <w:t>Además de la animación de entrada, se reforzaron otras animaciones: al agregar, eliminar o filtrar notas (por ejemplo, al buscar), las tarjetas restantes se reacomodan con una animación de posición en vez de saltar de golpe a su nuevo lugar.</w:t>
+        <w:t>reacomodan con una animación de posición en vez de saltar de golpe a su nuevo lugar.</w:t>
       </w:r>
     </w:p>
     <w:p>
@@ -2934,27 +2911,27 @@
           <w:bCs/>
           <w:lang w:eastAsia="es-MX"/>
         </w:rPr>
+        <w:t>Añadir gestos:</w:t>
+      </w:r>
+    </w:p>
+    <w:p>
+      <w:r>
+        <w:t xml:space="preserve">Se implementó un gesto de </w:t>
+      </w:r>
+      <w:r>
+        <w:rPr>
+          <w:b/>
+          <w:bCs/>
+        </w:rPr>
+        <w:t>deslizamiento (swipe</w:t>
+      </w:r>
+      <w:r>
+        <w:t>) para eliminar las notas.</w:t>
+      </w:r>
+    </w:p>
+    <w:p>
+      <w:r>
         <w:lastRenderedPageBreak/>
-        <w:t>Añadir gestos:</w:t>
-      </w:r>
-    </w:p>
-    <w:p>
-      <w:r>
-        <w:t xml:space="preserve">Se implementó un gesto de </w:t>
-      </w:r>
-      <w:r>
-        <w:rPr>
-          <w:b/>
-          <w:bCs/>
-        </w:rPr>
-        <w:t>deslizamiento (swipe</w:t>
-      </w:r>
-      <w:r>
-        <w:t>) para eliminar las notas.</w:t>
-      </w:r>
-    </w:p>
-    <w:p>
-      <w:r>
         <w:t>El usuario puede deslizar una nota hacia un lado para eliminarla. En la versión implementada se utiliza SwipeToDismissBox, que permite realizar esta acción de manera sencilla dentro de Jetpack Compose.</w:t>
       </w:r>
     </w:p>

</xml_diff>